<commit_message>
Unterrichtsbesuch umgeplant: Mustertext, Übersicht mit Karten, Exit-Ticket statt Fehlertext
Co-Authored-By: Claude Opus 5.5 <noreply@anthropic.com>
Claude-Session: https://claude.ai/code/session_01KXvLXHMYPnCyEbMRgNaaYs
</commit_message>
<xml_diff>
--- a/Deutsch_7A/Zeitformen_Zeitstrahl/Tafelskript_Zeitformen_Zeitstrahl.docx
+++ b/Deutsch_7A/Zeitformen_Zeitstrahl/Tafelskript_Zeitformen_Zeitstrahl.docx
@@ -93,7 +93,7 @@
                 <w:sz w:val="21"/>
                 <w:szCs w:val="21"/>
               </w:rPr>
-              <w:t xml:space="preserve">Letzte Stunde lief gut; die Satzstreifen mit Magneten kamen sehr gut an, waren aber zu klein – heute im Großformat (2 pro A4 quer). Auf den Schnipseln war zu wenig Platz – heute große Felder und viel Zeilenabstand. Alle Schüler hatten am Wochenende Wettkämpfe: Die Stunde startet dort. Ü11 wird zur Hausaufgabe über genau dieses Wochenende.</w:t>
+              <w:t xml:space="preserve">Letzte Stunde hat die Klasse einen Wettkampftag mit Satzstreifen am Zeitstrahl geordnet – das hat sie gut verstanden. Heute dasselbe Vorgehen mit einem Mustertext, der alle fünf Zeitformen enthält. Die Streifen sind diesmal im Großformat (2 pro A4 quer), die Schnipsel haben große Felder. Alle Schüler hatten am Wochenende Wettkämpfe – darüber schreiben sie am Ende selbst.</w:t>
             </w:r>
           </w:p>
         </w:tc>
@@ -121,7 +121,7 @@
           <w:sz w:val="21"/>
           <w:szCs w:val="21"/>
         </w:rPr>
-        <w:t xml:space="preserve">Die Klasse ordnet Sätze über ihr Wettkampfwochenende begründet den fünf Zeitformen am Zeitstrahl zu und erkennt, welche Zeitform in welchem Text passt (geschrieben: Präteritum, gesprochen: Perfekt, Vorgeschichte: Plusquamperfekt).</w:t>
+        <w:t xml:space="preserve">Die Klasse erarbeitet an einem Mustertext die zeitliche Abfolge und die Bildung der fünf Zeitformen als Übersicht und schreibt danach einen eigenen Text über ihr Wettkampfwochenende (Exit-Ticket).</w:t>
       </w:r>
     </w:p>
     <w:p>
@@ -383,7 +383,7 @@
                 <w:sz w:val="21"/>
                 <w:szCs w:val="21"/>
               </w:rPr>
-              <w:t xml:space="preserve">4′</w:t>
+              <w:t xml:space="preserve">3′</w:t>
             </w:r>
           </w:p>
         </w:tc>
@@ -451,7 +451,7 @@
                 <w:sz w:val="21"/>
                 <w:szCs w:val="21"/>
               </w:rPr>
-              <w:t xml:space="preserve">2–3 Schüler erzählen einen Satz – meist im Perfekt</w:t>
+              <w:t xml:space="preserve">2–3 Schüler erzählen einen Satz; Ziel der Stunde nennen</w:t>
             </w:r>
           </w:p>
         </w:tc>
@@ -491,7 +491,7 @@
                 <w:sz w:val="21"/>
                 <w:szCs w:val="21"/>
               </w:rPr>
-              <w:t xml:space="preserve">13′</w:t>
+              <w:t xml:space="preserve">9′</w:t>
             </w:r>
           </w:p>
         </w:tc>
@@ -525,7 +525,7 @@
                 <w:sz w:val="21"/>
                 <w:szCs w:val="21"/>
               </w:rPr>
-              <w:t xml:space="preserve">1 Magnet-Kette am Zeitstrahl</w:t>
+              <w:t xml:space="preserve">1 Mustertext am Zeitstrahl</w:t>
             </w:r>
           </w:p>
         </w:tc>
@@ -559,7 +559,7 @@
                 <w:sz w:val="21"/>
                 <w:szCs w:val="21"/>
               </w:rPr>
-              <w:t xml:space="preserve">8 Streifen hängen, markieren, begründen; Schnipsel mitschreiben</w:t>
+              <w:t xml:space="preserve">Magnet-Kette: 7 Streifen ordnen und markieren</w:t>
             </w:r>
           </w:p>
         </w:tc>
@@ -599,7 +599,7 @@
                 <w:sz w:val="21"/>
                 <w:szCs w:val="21"/>
               </w:rPr>
-              <w:t xml:space="preserve">7′</w:t>
+              <w:t xml:space="preserve">13′</w:t>
             </w:r>
           </w:p>
         </w:tc>
@@ -633,7 +633,7 @@
                 <w:sz w:val="21"/>
                 <w:szCs w:val="21"/>
               </w:rPr>
-              <w:t xml:space="preserve">2 Welche Zeitform wann? + Merksatz 10</w:t>
+              <w:t xml:space="preserve">2 Die Übersicht entsteht</w:t>
             </w:r>
           </w:p>
         </w:tc>
@@ -667,7 +667,7 @@
                 <w:sz w:val="21"/>
                 <w:szCs w:val="21"/>
               </w:rPr>
-              <w:t xml:space="preserve">Etiketten auswerten, Merksatz abschreiben</w:t>
+              <w:t xml:space="preserve">Kreide-Kette mit Karten; alle ergänzen die Tabelle</w:t>
             </w:r>
           </w:p>
         </w:tc>
@@ -707,7 +707,7 @@
                 <w:sz w:val="21"/>
                 <w:szCs w:val="21"/>
               </w:rPr>
-              <w:t xml:space="preserve">10′</w:t>
+              <w:t xml:space="preserve">15′</w:t>
             </w:r>
           </w:p>
         </w:tc>
@@ -741,7 +741,7 @@
                 <w:sz w:val="21"/>
                 <w:szCs w:val="21"/>
               </w:rPr>
-              <w:t xml:space="preserve">3 Ü12 Der Bericht für die Vereinszeitung</w:t>
+              <w:t xml:space="preserve">3 Exit-Ticket: mein Wochenende</w:t>
             </w:r>
           </w:p>
         </w:tc>
@@ -775,7 +775,7 @@
                 <w:sz w:val="21"/>
                 <w:szCs w:val="21"/>
               </w:rPr>
-              <w:t xml:space="preserve">4 Fehler finden, verbessern, einen begründen</w:t>
+              <w:t xml:space="preserve">eigener Text, jede Zeitform mindestens einmal</w:t>
             </w:r>
           </w:p>
         </w:tc>
@@ -815,7 +815,7 @@
                 <w:sz w:val="21"/>
                 <w:szCs w:val="21"/>
               </w:rPr>
-              <w:t xml:space="preserve">8′</w:t>
+              <w:t xml:space="preserve">5′</w:t>
             </w:r>
           </w:p>
         </w:tc>
@@ -849,7 +849,7 @@
                 <w:sz w:val="21"/>
                 <w:szCs w:val="21"/>
               </w:rPr>
-              <w:t xml:space="preserve">4 Kreide-Kette: Fehlerstreifen</w:t>
+              <w:t xml:space="preserve">4 Vorlesen und einsammeln</w:t>
             </w:r>
           </w:p>
         </w:tc>
@@ -883,115 +883,7 @@
                 <w:sz w:val="21"/>
                 <w:szCs w:val="21"/>
               </w:rPr>
-              <w:t xml:space="preserve">Verbesserung unter die Streifen, mit Grün verbessern</w:t>
-            </w:r>
-          </w:p>
-        </w:tc>
-      </w:tr>
-      <w:tr>
-        <w:trPr>
-          <w:cantSplit/>
-          <w:trHeight w:val="360" w:hRule="atLeast"/>
-        </w:trPr>
-        <w:tc>
-          <w:tcPr>
-            <w:tcW w:type="dxa" w:w="900"/>
-            <w:tcBorders>
-              <w:top w:val="single" w:color="B9C6E8" w:sz="6"/>
-              <w:left w:val="single" w:color="B9C6E8" w:sz="6"/>
-              <w:bottom w:val="single" w:color="B9C6E8" w:sz="6"/>
-              <w:right w:val="single" w:color="B9C6E8" w:sz="6"/>
-            </w:tcBorders>
-            <w:tcMar>
-              <w:top w:type="dxa" w:w="60"/>
-              <w:left w:type="dxa" w:w="100"/>
-              <w:bottom w:type="dxa" w:w="60"/>
-              <w:right w:type="dxa" w:w="100"/>
-            </w:tcMar>
-            <w:vAlign w:val="center"/>
-          </w:tcPr>
-          <w:p>
-            <w:pPr>
-              <w:spacing w:after="0" w:before="0"/>
-            </w:pPr>
-            <w:r>
-              <w:rPr>
-                <w:rFonts w:ascii="Calibri" w:cs="Calibri" w:eastAsia="Calibri" w:hAnsi="Calibri"/>
-                <w:b/>
-                <w:bCs/>
-                <w:color w:val="D9534F"/>
-                <w:sz w:val="21"/>
-                <w:szCs w:val="21"/>
-              </w:rPr>
-              <w:t xml:space="preserve">3′</w:t>
-            </w:r>
-          </w:p>
-        </w:tc>
-        <w:tc>
-          <w:tcPr>
-            <w:tcW w:type="dxa" w:w="3700"/>
-            <w:tcBorders>
-              <w:top w:val="single" w:color="B9C6E8" w:sz="6"/>
-              <w:left w:val="single" w:color="B9C6E8" w:sz="6"/>
-              <w:bottom w:val="single" w:color="B9C6E8" w:sz="6"/>
-              <w:right w:val="single" w:color="B9C6E8" w:sz="6"/>
-            </w:tcBorders>
-            <w:tcMar>
-              <w:top w:type="dxa" w:w="60"/>
-              <w:left w:type="dxa" w:w="100"/>
-              <w:bottom w:type="dxa" w:w="60"/>
-              <w:right w:type="dxa" w:w="100"/>
-            </w:tcMar>
-            <w:vAlign w:val="center"/>
-          </w:tcPr>
-          <w:p>
-            <w:pPr>
-              <w:spacing w:after="0" w:before="0"/>
-            </w:pPr>
-            <w:r>
-              <w:rPr>
-                <w:rFonts w:ascii="Calibri" w:cs="Calibri" w:eastAsia="Calibri" w:hAnsi="Calibri"/>
-                <w:b/>
-                <w:bCs/>
-                <w:color w:val="1E2761"/>
-                <w:sz w:val="21"/>
-                <w:szCs w:val="21"/>
-              </w:rPr>
-              <w:t xml:space="preserve">5 Ausblick und Hausaufgabe</w:t>
-            </w:r>
-          </w:p>
-        </w:tc>
-        <w:tc>
-          <w:tcPr>
-            <w:tcW w:type="dxa" w:w="5606"/>
-            <w:tcBorders>
-              <w:top w:val="single" w:color="B9C6E8" w:sz="6"/>
-              <w:left w:val="single" w:color="B9C6E8" w:sz="6"/>
-              <w:bottom w:val="single" w:color="B9C6E8" w:sz="6"/>
-              <w:right w:val="single" w:color="B9C6E8" w:sz="6"/>
-            </w:tcBorders>
-            <w:tcMar>
-              <w:top w:type="dxa" w:w="60"/>
-              <w:left w:type="dxa" w:w="100"/>
-              <w:bottom w:type="dxa" w:w="60"/>
-              <w:right w:type="dxa" w:w="100"/>
-            </w:tcMar>
-            <w:vAlign w:val="center"/>
-          </w:tcPr>
-          <w:p>
-            <w:pPr>
-              <w:spacing w:after="0" w:before="0"/>
-            </w:pPr>
-            <w:r>
-              <w:rPr>
-                <w:rFonts w:ascii="Calibri" w:cs="Calibri" w:eastAsia="Calibri" w:hAnsi="Calibri"/>
-                <w:b w:val="false"/>
-                <w:bCs w:val="false"/>
-                <w:color w:val="000000"/>
-                <w:sz w:val="21"/>
-                <w:szCs w:val="21"/>
-              </w:rPr>
-              <w:t xml:space="preserve">Bericht über dieses Wochenende (Schreibrahmen Ü11)</w:t>
+              <w:t xml:space="preserve">zwei Texte, Klasse zeigt am Zeitstrahl mit</w:t>
             </w:r>
           </w:p>
         </w:tc>
@@ -1019,7 +911,7 @@
           <w:sz w:val="21"/>
           <w:szCs w:val="21"/>
         </w:rPr>
-        <w:t xml:space="preserve">Speed-Duell zu zweit (einer liest einen Satz vom Zeitstrahl in einer anderen Zeitform, der andere bestimmt sie). Kürzung: In Phase 4 nur zwei Fehlerstreifen besprechen, den Rest nächste Stunde.</w:t>
+        <w:t xml:space="preserve">Speed-Duell zu zweit (einer liest einen Satz vom Zeitstrahl in einer anderen Zeitform, der andere bestimmt sie). Kürzung: Beim Exit-Ticket reichen fünf Sätze, in Phase 4 liest nur einer vor.</w:t>
       </w:r>
     </w:p>
     <w:p>
@@ -1196,7 +1088,7 @@
                 <w:sz w:val="20"/>
                 <w:szCs w:val="20"/>
               </w:rPr>
-              <w:t xml:space="preserve">Die Zeitformen am Zeitstrahl (Zeitform, Bauplan, Beispielsatz je Abschnitt)</w:t>
+              <w:t xml:space="preserve">Die Zeitformen im Überblick (Tabelle: Zeitform, Bauplan, Beispielsatz – mit „Wofür?“ und „Test“)</w:t>
             </w:r>
           </w:p>
         </w:tc>
@@ -1233,11 +1125,11 @@
                 <w:rFonts w:ascii="Calibri" w:cs="Calibri" w:eastAsia="Calibri" w:hAnsi="Calibri"/>
                 <w:b/>
                 <w:bCs/>
-                <w:color w:val="D9534F"/>
+                <w:color w:val="C77C12"/>
                 <w:sz w:val="20"/>
                 <w:szCs w:val="20"/>
               </w:rPr>
-              <w:t xml:space="preserve">Merksatz 10</w:t>
+              <w:t xml:space="preserve">Exit-Ticket</w:t>
             </w:r>
           </w:p>
         </w:tc>
@@ -1269,153 +1161,7 @@
                 <w:sz w:val="20"/>
                 <w:szCs w:val="20"/>
               </w:rPr>
-              <w:t xml:space="preserve">Welche Zeitform wann?</w:t>
-            </w:r>
-          </w:p>
-        </w:tc>
-      </w:tr>
-      <w:tr>
-        <w:trPr>
-          <w:cantSplit/>
-          <w:trHeight w:val="340" w:hRule="atLeast"/>
-        </w:trPr>
-        <w:tc>
-          <w:tcPr>
-            <w:tcW w:type="dxa" w:w="2300"/>
-            <w:tcBorders>
-              <w:top w:val="single" w:color="B9C6E8" w:sz="6"/>
-              <w:left w:val="single" w:color="B9C6E8" w:sz="6"/>
-              <w:bottom w:val="single" w:color="B9C6E8" w:sz="6"/>
-              <w:right w:val="single" w:color="B9C6E8" w:sz="6"/>
-            </w:tcBorders>
-            <w:shd w:fill="F4F7FD" w:color="auto" w:val="clear"/>
-            <w:tcMar>
-              <w:top w:type="dxa" w:w="60"/>
-              <w:left w:type="dxa" w:w="100"/>
-              <w:bottom w:type="dxa" w:w="60"/>
-              <w:right w:type="dxa" w:w="100"/>
-            </w:tcMar>
-            <w:vAlign w:val="center"/>
-          </w:tcPr>
-          <w:p>
-            <w:pPr>
-              <w:spacing w:after="0" w:before="0"/>
-            </w:pPr>
-            <w:r>
-              <w:rPr>
-                <w:rFonts w:ascii="Calibri" w:cs="Calibri" w:eastAsia="Calibri" w:hAnsi="Calibri"/>
-                <w:b/>
-                <w:bCs/>
-                <w:color w:val="C77C12"/>
-                <w:sz w:val="20"/>
-                <w:szCs w:val="20"/>
-              </w:rPr>
-              <w:t xml:space="preserve">Ü12</w:t>
-            </w:r>
-          </w:p>
-        </w:tc>
-        <w:tc>
-          <w:tcPr>
-            <w:tcW w:type="dxa" w:w="7906"/>
-            <w:tcBorders>
-              <w:top w:val="single" w:color="B9C6E8" w:sz="6"/>
-              <w:left w:val="single" w:color="B9C6E8" w:sz="6"/>
-              <w:bottom w:val="single" w:color="B9C6E8" w:sz="6"/>
-              <w:right w:val="single" w:color="B9C6E8" w:sz="6"/>
-            </w:tcBorders>
-            <w:tcMar>
-              <w:top w:type="dxa" w:w="60"/>
-              <w:left w:type="dxa" w:w="100"/>
-              <w:bottom w:type="dxa" w:w="60"/>
-              <w:right w:type="dxa" w:w="100"/>
-            </w:tcMar>
-            <w:vAlign w:val="center"/>
-          </w:tcPr>
-          <w:p>
-            <w:pPr>
-              <w:spacing w:after="0" w:before="0"/>
-            </w:pPr>
-            <w:r>
-              <w:rPr>
-                <w:rFonts w:ascii="Calibri" w:cs="Calibri" w:eastAsia="Calibri" w:hAnsi="Calibri"/>
-                <w:color w:val="000000"/>
-                <w:sz w:val="20"/>
-                <w:szCs w:val="20"/>
-              </w:rPr>
-              <w:t xml:space="preserve">Schnipsel eingeklebt und verbessert · darunter: ein Fehler begründet (+ Zusatz)</w:t>
-            </w:r>
-          </w:p>
-        </w:tc>
-      </w:tr>
-      <w:tr>
-        <w:trPr>
-          <w:cantSplit/>
-          <w:trHeight w:val="340" w:hRule="atLeast"/>
-        </w:trPr>
-        <w:tc>
-          <w:tcPr>
-            <w:tcW w:type="dxa" w:w="2300"/>
-            <w:tcBorders>
-              <w:top w:val="single" w:color="B9C6E8" w:sz="6"/>
-              <w:left w:val="single" w:color="B9C6E8" w:sz="6"/>
-              <w:bottom w:val="single" w:color="B9C6E8" w:sz="6"/>
-              <w:right w:val="single" w:color="B9C6E8" w:sz="6"/>
-            </w:tcBorders>
-            <w:shd w:fill="F4F7FD" w:color="auto" w:val="clear"/>
-            <w:tcMar>
-              <w:top w:type="dxa" w:w="60"/>
-              <w:left w:type="dxa" w:w="100"/>
-              <w:bottom w:type="dxa" w:w="60"/>
-              <w:right w:type="dxa" w:w="100"/>
-            </w:tcMar>
-            <w:vAlign w:val="center"/>
-          </w:tcPr>
-          <w:p>
-            <w:pPr>
-              <w:spacing w:after="0" w:before="0"/>
-            </w:pPr>
-            <w:r>
-              <w:rPr>
-                <w:rFonts w:ascii="Calibri" w:cs="Calibri" w:eastAsia="Calibri" w:hAnsi="Calibri"/>
-                <w:b/>
-                <w:bCs/>
-                <w:color w:val="C77C12"/>
-                <w:sz w:val="20"/>
-                <w:szCs w:val="20"/>
-              </w:rPr>
-              <w:t xml:space="preserve">Hausaufgabe</w:t>
-            </w:r>
-          </w:p>
-        </w:tc>
-        <w:tc>
-          <w:tcPr>
-            <w:tcW w:type="dxa" w:w="7906"/>
-            <w:tcBorders>
-              <w:top w:val="single" w:color="B9C6E8" w:sz="6"/>
-              <w:left w:val="single" w:color="B9C6E8" w:sz="6"/>
-              <w:bottom w:val="single" w:color="B9C6E8" w:sz="6"/>
-              <w:right w:val="single" w:color="B9C6E8" w:sz="6"/>
-            </w:tcBorders>
-            <w:tcMar>
-              <w:top w:type="dxa" w:w="60"/>
-              <w:left w:type="dxa" w:w="100"/>
-              <w:bottom w:type="dxa" w:w="60"/>
-              <w:right w:type="dxa" w:w="100"/>
-            </w:tcMar>
-            <w:vAlign w:val="center"/>
-          </w:tcPr>
-          <w:p>
-            <w:pPr>
-              <w:spacing w:after="0" w:before="0"/>
-            </w:pPr>
-            <w:r>
-              <w:rPr>
-                <w:rFonts w:ascii="Calibri" w:cs="Calibri" w:eastAsia="Calibri" w:hAnsi="Calibri"/>
-                <w:color w:val="000000"/>
-                <w:sz w:val="20"/>
-                <w:szCs w:val="20"/>
-              </w:rPr>
-              <w:t xml:space="preserve">Bericht über das Wettkampfwochenende (Schreibrahmen Ü11)</w:t>
+              <w:t xml:space="preserve">wird eingesammelt (zurückgeben und einkleben in der nächsten Stunde)</w:t>
             </w:r>
           </w:p>
         </w:tc>
@@ -1443,7 +1189,7 @@
           <w:sz w:val="21"/>
           <w:szCs w:val="21"/>
         </w:rPr>
-        <w:t xml:space="preserve">Druckvorlage: Seite 1 Zeitstrahl-Schnipsel (2 pro A4), Seite 2 Ü12 (2 pro A4), Seiten 3–8 zwölf Streifen für die Tafel (einmal drucken, schneiden, Magnete): 8 Satzstreifen und 4 Fehlerstreifen „Bericht · Satz …“. Kreide rot, gelb, blau · Schüler: Heft, Kleber, Buntstifte rot, gelb, blau, grün.</w:t>
+        <w:t xml:space="preserve">Druckvorlage: Seite 1 Tabelle (2 pro A4), Seite 2 Exit-Ticket (2 pro A4), Seiten 3–11 für die Tafel (einmal drucken, schneiden, Magnete): 7 Streifen Mustertext, 5 Zeitform-Karten, 5 Bauplan-Karten. Kreide rot, gelb, blau · Schüler: Heft, Kleber, Buntstifte rot, gelb, blau.</w:t>
       </w:r>
     </w:p>
     <w:p>
@@ -1468,7 +1214,7 @@
           <w:sz w:val="21"/>
           <w:szCs w:val="21"/>
         </w:rPr>
-        <w:t xml:space="preserve">Zeitstrahl vorab über die ganze Tafel zeichnen (Pfeil, Abschnitte „vorher – Vergangenheit – jetzt – Zukunft“), darüber die Stundenfrage „Welche Zeitform wann?“. Die 8 Satzstreifen gemischt an den Rand hängen, die 4 Fehlerstreifen noch zurückhalten. Merksatz 10 auf die Seitentafel schreiben und zuklappen.</w:t>
+        <w:t xml:space="preserve">Zeitstrahl über die ganze Tafel zeichnen (Pfeil, Abschnitte „vorher – Vergangenheit – jetzt – Zukunft“; Vergangenheit doppelt so breit), darüber die Stundenfrage „Welche Zeitform wann?“. Mustertext-Streifen gemischt links an den Rand hängen, Zeitform- und Bauplan-Karten gemischt rechts – die Karten erst in Phase 2 zeigen.</w:t>
       </w:r>
     </w:p>
     <w:p>
@@ -1507,7 +1253,7 @@
           <w:sz w:val="20"/>
           <w:szCs w:val="20"/>
         </w:rPr>
-        <w:t xml:space="preserve">   4 Min.</w:t>
+        <w:t xml:space="preserve">   3 Min.</w:t>
       </w:r>
     </w:p>
     <w:tbl>
@@ -1634,7 +1380,7 @@
                 <w:sz w:val="21"/>
                 <w:szCs w:val="21"/>
               </w:rPr>
-              <w:t xml:space="preserve">Zwei bis drei Schüler drannehmen, aus jeder Sportart einen. Die Verbform im Kopf mitnotieren – erwartbar ist Perfekt („Ich habe gewonnen“, „Wir sind Zweiter geworden“).</w:t>
+              <w:t xml:space="preserve">Zwei bis drei Schüler drannehmen, möglichst aus jeder Sportart einen.</w:t>
             </w:r>
           </w:p>
         </w:tc>
@@ -1764,21 +1510,7 @@
                 <w:sz w:val="21"/>
                 <w:szCs w:val="21"/>
               </w:rPr>
-              <w:t xml:space="preserve">„Ihr habt gerade alle im Perfekt erzählt. In der Vereinszeitung klingt das anders. An der Tafel hängen acht Sätze aus drei Texten über so ein Wochenende: aus einer Sprachnachricht, aus der Vereinszeitung und aus einem Post. Heute klären wir: Welche Zeitform wann?“</w:t>
-            </w:r>
-          </w:p>
-          <w:p>
-            <w:pPr>
-              <w:spacing w:after="50" w:before="0"/>
-            </w:pPr>
-            <w:r>
-              <w:rPr>
-                <w:rFonts w:ascii="Calibri" w:cs="Calibri" w:eastAsia="Calibri" w:hAnsi="Calibri"/>
-                <w:color w:val="000000"/>
-                <w:sz w:val="21"/>
-                <w:szCs w:val="21"/>
-              </w:rPr>
-              <w:t xml:space="preserve">Auf die Stundenfrage über dem Zeitstrahl zeigen. Heft auf, Datum, Überschrift: Welche Zeitform wann?</w:t>
+              <w:t xml:space="preserve">„Am Ende der Stunde schreibt ihr euer Wochenende auf – mit allen Zeitformen, die ihr kennt. Vorher schauen wir uns an, wie das bei einer Judoka aussieht. Heft auf, Datum, Überschrift: Welche Zeitform wann?“</w:t>
             </w:r>
           </w:p>
         </w:tc>
@@ -1823,7 +1555,7 @@
           <w:sz w:val="28"/>
           <w:szCs w:val="28"/>
         </w:rPr>
-        <w:t xml:space="preserve">Magnet-Kette am Zeitstrahl</w:t>
+        <w:t xml:space="preserve">Mustertext am Zeitstrahl</w:t>
       </w:r>
       <w:r>
         <w:rPr>
@@ -1834,7 +1566,7 @@
           <w:sz w:val="20"/>
           <w:szCs w:val="20"/>
         </w:rPr>
-        <w:t xml:space="preserve">   13 Min.</w:t>
+        <w:t xml:space="preserve">   9 Min.</w:t>
       </w:r>
     </w:p>
     <w:tbl>
@@ -1947,7 +1679,7 @@
                 <w:sz w:val="21"/>
                 <w:szCs w:val="21"/>
               </w:rPr>
-              <w:t xml:space="preserve">„Ihr bekommt einen Schnipsel. Klebt ihn ein. Wer drankommt, hängt einen Streifen an die richtige Stelle am Zeitstrahl, markiert die Verbformen, nennt die Zeitform und begründet. Alle anderen prüfen mit und tragen die Zeitform und einen Beispielsatz in den Schnipsel ein.“</w:t>
+              <w:t xml:space="preserve">„Stifte liegen. Links hängen sieben Sätze einer Judoka – durcheinander. Wer drankommt, hängt einen Streifen an die richtige Stelle am Zeitstrahl, markiert die Verbformen und sagt, woran er es erkennt. Alle prüfen mit.“</w:t>
             </w:r>
           </w:p>
           <w:p>
@@ -1961,7 +1693,7 @@
                 <w:sz w:val="21"/>
                 <w:szCs w:val="21"/>
               </w:rPr>
-              <w:t xml:space="preserve">Begründung immer im gleichen Muster einfordern: „Das ist Plusquamperfekt, weil hatte (Hilfsverb im Präteritum) + Partizip II.“</w:t>
+              <w:t xml:space="preserve">Begründung über die Zeitangabe und die Verbform einfordern: „Vor dem Turnier – und hatte + trainiert, das war vorher.“</w:t>
             </w:r>
           </w:p>
           <w:p>
@@ -1975,21 +1707,7 @@
                 <w:sz w:val="21"/>
                 <w:szCs w:val="21"/>
               </w:rPr>
-              <w:t xml:space="preserve">Die Zeitform schreibt der Schüler mit Kreide über seinen Streifen. Präteritum und Perfekt landen beide bei „Vergangenheit“ – das stehen lassen, es ist der Anlass für Phase 2.</w:t>
-            </w:r>
-          </w:p>
-          <w:p>
-            <w:pPr>
-              <w:spacing w:after="50" w:before="0"/>
-            </w:pPr>
-            <w:r>
-              <w:rPr>
-                <w:rFonts w:ascii="Calibri" w:cs="Calibri" w:eastAsia="Calibri" w:hAnsi="Calibri"/>
-                <w:color w:val="000000"/>
-                <w:sz w:val="21"/>
-                <w:szCs w:val="21"/>
-              </w:rPr>
-              <w:t xml:space="preserve">Nach jedem Streifen kurz warten, bis alle eingetragen haben. Ein Beispielsatz pro Zeitform im Schnipsel reicht.</w:t>
+              <w:t xml:space="preserve">Die beiden vorher-Sätze dürfen getauscht hängen, ebenso Samstag/Finale in sinnvoller Reihenfolge.</w:t>
             </w:r>
           </w:p>
           <w:tbl>
@@ -2042,7 +1760,7 @@
                       <w:sz w:val="16"/>
                       <w:szCs w:val="16"/>
                     </w:rPr>
-                    <w:t xml:space="preserve">TAFEL · Mitte · Zeitstrahl mit den Streifen (Lösung)</w:t>
+                    <w:t xml:space="preserve">TAFEL · Mitte · Zeitstrahl mit dem Mustertext (Lösung)</w:t>
                   </w:r>
                 </w:p>
               </w:tc>
@@ -2087,13 +1805,116 @@
                   <w:r>
                     <w:rPr>
                       <w:rFonts w:ascii="Cambria" w:cs="Cambria" w:eastAsia="Cambria" w:hAnsi="Cambria"/>
-                      <w:b/>
-                      <w:bCs/>
-                      <w:color w:val="1E2761"/>
-                      <w:sz w:val="22"/>
-                      <w:szCs w:val="22"/>
-                    </w:rPr>
-                    <w:t xml:space="preserve">Plusquamperfekt</w:t>
+                      <w:color w:val="000000"/>
+                      <w:sz w:val="20"/>
+                      <w:szCs w:val="20"/>
+                    </w:rPr>
+                    <w:t xml:space="preserve">Vor dem Turnier </w:t>
+                  </w:r>
+                  <w:r>
+                    <w:rPr>
+                      <w:rFonts w:ascii="Cambria" w:cs="Cambria" w:eastAsia="Cambria" w:hAnsi="Cambria"/>
+                      <w:b/>
+                      <w:bCs/>
+                      <w:color w:val="D9534F"/>
+                      <w:sz w:val="20"/>
+                      <w:szCs w:val="20"/>
+                    </w:rPr>
+                    <w:t xml:space="preserve">hatte</w:t>
+                  </w:r>
+                  <w:r>
+                    <w:rPr>
+                      <w:rFonts w:ascii="Cambria" w:cs="Cambria" w:eastAsia="Cambria" w:hAnsi="Cambria"/>
+                      <w:color w:val="000000"/>
+                      <w:sz w:val="20"/>
+                      <w:szCs w:val="20"/>
+                    </w:rPr>
+                    <w:t xml:space="preserve"> ich wochenlang hart </w:t>
+                  </w:r>
+                  <w:r>
+                    <w:rPr>
+                      <w:rFonts w:ascii="Cambria" w:cs="Cambria" w:eastAsia="Cambria" w:hAnsi="Cambria"/>
+                      <w:b/>
+                      <w:bCs/>
+                      <w:color w:val="C98A1E"/>
+                      <w:sz w:val="20"/>
+                      <w:szCs w:val="20"/>
+                    </w:rPr>
+                    <w:t xml:space="preserve">trainiert</w:t>
+                  </w:r>
+                  <w:r>
+                    <w:rPr>
+                      <w:rFonts w:ascii="Cambria" w:cs="Cambria" w:eastAsia="Cambria" w:hAnsi="Cambria"/>
+                      <w:color w:val="000000"/>
+                      <w:sz w:val="20"/>
+                      <w:szCs w:val="20"/>
+                    </w:rPr>
+                    <w:t xml:space="preserve">.</w:t>
+                  </w:r>
+                </w:p>
+                <w:p>
+                  <w:pPr>
+                    <w:spacing w:after="50" w:before="0"/>
+                  </w:pPr>
+                  <w:r>
+                    <w:rPr>
+                      <w:rFonts w:ascii="Calibri" w:cs="Calibri" w:eastAsia="Calibri" w:hAnsi="Calibri"/>
+                      <w:b/>
+                      <w:bCs/>
+                      <w:color w:val="5B6B8C"/>
+                      <w:sz w:val="16"/>
+                      <w:szCs w:val="16"/>
+                    </w:rPr>
+                    <w:t xml:space="preserve">vorher   </w:t>
+                  </w:r>
+                  <w:r>
+                    <w:rPr>
+                      <w:rFonts w:ascii="Cambria" w:cs="Cambria" w:eastAsia="Cambria" w:hAnsi="Cambria"/>
+                      <w:color w:val="000000"/>
+                      <w:sz w:val="20"/>
+                      <w:szCs w:val="20"/>
+                    </w:rPr>
+                    <w:t xml:space="preserve">Am Freitag </w:t>
+                  </w:r>
+                  <w:r>
+                    <w:rPr>
+                      <w:rFonts w:ascii="Cambria" w:cs="Cambria" w:eastAsia="Cambria" w:hAnsi="Cambria"/>
+                      <w:b/>
+                      <w:bCs/>
+                      <w:color w:val="D9534F"/>
+                      <w:sz w:val="20"/>
+                      <w:szCs w:val="20"/>
+                    </w:rPr>
+                    <w:t xml:space="preserve">waren</w:t>
+                  </w:r>
+                  <w:r>
+                    <w:rPr>
+                      <w:rFonts w:ascii="Cambria" w:cs="Cambria" w:eastAsia="Cambria" w:hAnsi="Cambria"/>
+                      <w:color w:val="000000"/>
+                      <w:sz w:val="20"/>
+                      <w:szCs w:val="20"/>
+                    </w:rPr>
+                    <w:t xml:space="preserve"> wir mit dem Team nach Leipzig </w:t>
+                  </w:r>
+                  <w:r>
+                    <w:rPr>
+                      <w:rFonts w:ascii="Cambria" w:cs="Cambria" w:eastAsia="Cambria" w:hAnsi="Cambria"/>
+                      <w:b/>
+                      <w:bCs/>
+                      <w:color w:val="C98A1E"/>
+                      <w:sz w:val="20"/>
+                      <w:szCs w:val="20"/>
+                    </w:rPr>
+                    <w:t xml:space="preserve">gefahren</w:t>
+                  </w:r>
+                  <w:r>
+                    <w:rPr>
+                      <w:rFonts w:ascii="Cambria" w:cs="Cambria" w:eastAsia="Cambria" w:hAnsi="Cambria"/>
+                      <w:color w:val="000000"/>
+                      <w:sz w:val="20"/>
+                      <w:szCs w:val="20"/>
+                    </w:rPr>
+                    <w:t xml:space="preserve">.</w:t>
                   </w:r>
                 </w:p>
                 <w:p>
@@ -2109,7 +1930,7 @@
                       <w:sz w:val="16"/>
                       <w:szCs w:val="16"/>
                     </w:rPr>
-                    <w:t xml:space="preserve">ZEITUNG   </w:t>
+                    <w:t xml:space="preserve">Vergangenheit   </w:t>
                   </w:r>
                   <w:r>
                     <w:rPr>
@@ -2118,38 +1939,19 @@
                       <w:sz w:val="20"/>
                       <w:szCs w:val="20"/>
                     </w:rPr>
-                    <w:t xml:space="preserve">Die Judoka </w:t>
-                  </w:r>
-                  <w:r>
-                    <w:rPr>
-                      <w:rFonts w:ascii="Cambria" w:cs="Cambria" w:eastAsia="Cambria" w:hAnsi="Cambria"/>
-                      <w:b/>
-                      <w:bCs/>
-                      <w:color w:val="D9534F"/>
-                      <w:sz w:val="20"/>
-                      <w:szCs w:val="20"/>
-                    </w:rPr>
-                    <w:t xml:space="preserve">hatten</w:t>
-                  </w:r>
-                  <w:r>
-                    <w:rPr>
-                      <w:rFonts w:ascii="Cambria" w:cs="Cambria" w:eastAsia="Cambria" w:hAnsi="Cambria"/>
+                    <w:t xml:space="preserve">Am Samstag </w:t>
+                  </w:r>
+                  <w:r>
+                    <w:rPr>
+                      <w:rFonts w:ascii="Cambria" w:cs="Cambria" w:eastAsia="Cambria" w:hAnsi="Cambria"/>
+                      <w:b/>
+                      <w:bCs/>
                       <w:color w:val="000000"/>
                       <w:sz w:val="20"/>
                       <w:szCs w:val="20"/>
-                    </w:rPr>
-                    <w:t xml:space="preserve"> wochenlang für das Turnier </w:t>
-                  </w:r>
-                  <w:r>
-                    <w:rPr>
-                      <w:rFonts w:ascii="Cambria" w:cs="Cambria" w:eastAsia="Cambria" w:hAnsi="Cambria"/>
-                      <w:b/>
-                      <w:bCs/>
-                      <w:color w:val="C98A1E"/>
-                      <w:sz w:val="20"/>
-                      <w:szCs w:val="20"/>
-                    </w:rPr>
-                    <w:t xml:space="preserve">trainiert</w:t>
+                      <w:u w:val="single"/>
+                    </w:rPr>
+                    <w:t xml:space="preserve">kämpfte</w:t>
                   </w:r>
                   <w:r>
                     <w:rPr>
@@ -2158,72 +1960,7 @@
                       <w:sz w:val="20"/>
                       <w:szCs w:val="20"/>
                     </w:rPr>
-                    <w:t xml:space="preserve">.</w:t>
-                  </w:r>
-                </w:p>
-                <w:p>
-                  <w:pPr>
-                    <w:spacing w:after="60" w:before="0"/>
-                  </w:pPr>
-                  <w:r>
-                    <w:rPr>
-                      <w:rFonts w:ascii="Calibri" w:cs="Calibri" w:eastAsia="Calibri" w:hAnsi="Calibri"/>
-                      <w:b/>
-                      <w:bCs/>
-                      <w:color w:val="5B6B8C"/>
-                      <w:sz w:val="16"/>
-                      <w:szCs w:val="16"/>
-                    </w:rPr>
-                    <w:t xml:space="preserve">ZEITUNG   </w:t>
-                  </w:r>
-                  <w:r>
-                    <w:rPr>
-                      <w:rFonts w:ascii="Cambria" w:cs="Cambria" w:eastAsia="Cambria" w:hAnsi="Cambria"/>
-                      <w:color w:val="000000"/>
-                      <w:sz w:val="20"/>
-                      <w:szCs w:val="20"/>
-                    </w:rPr>
-                    <w:t xml:space="preserve">Die Handballer </w:t>
-                  </w:r>
-                  <w:r>
-                    <w:rPr>
-                      <w:rFonts w:ascii="Cambria" w:cs="Cambria" w:eastAsia="Cambria" w:hAnsi="Cambria"/>
-                      <w:b/>
-                      <w:bCs/>
-                      <w:color w:val="D9534F"/>
-                      <w:sz w:val="20"/>
-                      <w:szCs w:val="20"/>
-                    </w:rPr>
-                    <w:t xml:space="preserve">waren</w:t>
-                  </w:r>
-                  <w:r>
-                    <w:rPr>
-                      <w:rFonts w:ascii="Cambria" w:cs="Cambria" w:eastAsia="Cambria" w:hAnsi="Cambria"/>
-                      <w:color w:val="000000"/>
-                      <w:sz w:val="20"/>
-                      <w:szCs w:val="20"/>
-                    </w:rPr>
-                    <w:t xml:space="preserve"> schon am Freitag </w:t>
-                  </w:r>
-                  <w:r>
-                    <w:rPr>
-                      <w:rFonts w:ascii="Cambria" w:cs="Cambria" w:eastAsia="Cambria" w:hAnsi="Cambria"/>
-                      <w:b/>
-                      <w:bCs/>
-                      <w:color w:val="C98A1E"/>
-                      <w:sz w:val="20"/>
-                      <w:szCs w:val="20"/>
-                    </w:rPr>
-                    <w:t xml:space="preserve">angereist</w:t>
-                  </w:r>
-                  <w:r>
-                    <w:rPr>
-                      <w:rFonts w:ascii="Cambria" w:cs="Cambria" w:eastAsia="Cambria" w:hAnsi="Cambria"/>
-                      <w:color w:val="000000"/>
-                      <w:sz w:val="20"/>
-                      <w:szCs w:val="20"/>
-                    </w:rPr>
-                    <w:t xml:space="preserve">.</w:t>
+                    <w:t xml:space="preserve"> ich in der Klasse bis 50 Kilo.</w:t>
                   </w:r>
                 </w:p>
                 <w:p>
@@ -2244,18 +1981,37 @@
                   <w:r>
                     <w:rPr>
                       <w:rFonts w:ascii="Cambria" w:cs="Cambria" w:eastAsia="Cambria" w:hAnsi="Cambria"/>
-                      <w:b/>
-                      <w:bCs/>
-                      <w:color w:val="1E2761"/>
-                      <w:sz w:val="22"/>
-                      <w:szCs w:val="22"/>
-                    </w:rPr>
-                    <w:t xml:space="preserve">Präteritum</w:t>
+                      <w:color w:val="000000"/>
+                      <w:sz w:val="20"/>
+                      <w:szCs w:val="20"/>
+                    </w:rPr>
+                    <w:t xml:space="preserve">Im Finale </w:t>
+                  </w:r>
+                  <w:r>
+                    <w:rPr>
+                      <w:rFonts w:ascii="Cambria" w:cs="Cambria" w:eastAsia="Cambria" w:hAnsi="Cambria"/>
+                      <w:b/>
+                      <w:bCs/>
+                      <w:color w:val="000000"/>
+                      <w:sz w:val="20"/>
+                      <w:szCs w:val="20"/>
+                      <w:u w:val="single"/>
+                    </w:rPr>
+                    <w:t xml:space="preserve">verlor</w:t>
+                  </w:r>
+                  <w:r>
+                    <w:rPr>
+                      <w:rFonts w:ascii="Cambria" w:cs="Cambria" w:eastAsia="Cambria" w:hAnsi="Cambria"/>
+                      <w:color w:val="000000"/>
+                      <w:sz w:val="20"/>
+                      <w:szCs w:val="20"/>
+                    </w:rPr>
+                    <w:t xml:space="preserve"> ich nur knapp.</w:t>
                   </w:r>
                 </w:p>
                 <w:p>
                   <w:pPr>
-                    <w:spacing w:after="10" w:before="0"/>
+                    <w:spacing w:after="50" w:before="0"/>
                   </w:pPr>
                   <w:r>
                     <w:rPr>
@@ -2266,7 +2022,7 @@
                       <w:sz w:val="16"/>
                       <w:szCs w:val="16"/>
                     </w:rPr>
-                    <w:t xml:space="preserve">ZEITUNG   </w:t>
+                    <w:t xml:space="preserve">Vergangenheit   </w:t>
                   </w:r>
                   <w:r>
                     <w:rPr>
@@ -2275,7 +2031,7 @@
                       <w:sz w:val="20"/>
                       <w:szCs w:val="20"/>
                     </w:rPr>
-                    <w:t xml:space="preserve">Im Stoßen </w:t>
+                    <w:t xml:space="preserve">Danach </w:t>
                   </w:r>
                   <w:r>
                     <w:rPr>
@@ -2287,7 +2043,7 @@
                       <w:szCs w:val="20"/>
                       <w:u w:val="single"/>
                     </w:rPr>
-                    <w:t xml:space="preserve">hob</w:t>
+                    <w:t xml:space="preserve">sagte</w:t>
                   </w:r>
                   <w:r>
                     <w:rPr>
@@ -2296,12 +2052,52 @@
                       <w:sz w:val="20"/>
                       <w:szCs w:val="20"/>
                     </w:rPr>
-                    <w:t xml:space="preserve"> unsere Gewichtheberin 75 Kilo.</w:t>
+                    <w:t xml:space="preserve"> mein Trainer: „Du </w:t>
+                  </w:r>
+                  <w:r>
+                    <w:rPr>
+                      <w:rFonts w:ascii="Cambria" w:cs="Cambria" w:eastAsia="Cambria" w:hAnsi="Cambria"/>
+                      <w:b/>
+                      <w:bCs/>
+                      <w:color w:val="D9534F"/>
+                      <w:sz w:val="20"/>
+                      <w:szCs w:val="20"/>
+                    </w:rPr>
+                    <w:t xml:space="preserve">hast</w:t>
+                  </w:r>
+                  <w:r>
+                    <w:rPr>
+                      <w:rFonts w:ascii="Cambria" w:cs="Cambria" w:eastAsia="Cambria" w:hAnsi="Cambria"/>
+                      <w:color w:val="000000"/>
+                      <w:sz w:val="20"/>
+                      <w:szCs w:val="20"/>
+                    </w:rPr>
+                    <w:t xml:space="preserve"> stark </w:t>
+                  </w:r>
+                  <w:r>
+                    <w:rPr>
+                      <w:rFonts w:ascii="Cambria" w:cs="Cambria" w:eastAsia="Cambria" w:hAnsi="Cambria"/>
+                      <w:b/>
+                      <w:bCs/>
+                      <w:color w:val="C98A1E"/>
+                      <w:sz w:val="20"/>
+                      <w:szCs w:val="20"/>
+                    </w:rPr>
+                    <w:t xml:space="preserve">gekämpft</w:t>
+                  </w:r>
+                  <w:r>
+                    <w:rPr>
+                      <w:rFonts w:ascii="Cambria" w:cs="Cambria" w:eastAsia="Cambria" w:hAnsi="Cambria"/>
+                      <w:color w:val="000000"/>
+                      <w:sz w:val="20"/>
+                      <w:szCs w:val="20"/>
+                    </w:rPr>
+                    <w:t xml:space="preserve">!“</w:t>
                   </w:r>
                 </w:p>
                 <w:p>
                   <w:pPr>
-                    <w:spacing w:after="60" w:before="0"/>
+                    <w:spacing w:after="50" w:before="0"/>
                   </w:pPr>
                   <w:r>
                     <w:rPr>
@@ -2312,7 +2108,7 @@
                       <w:sz w:val="16"/>
                       <w:szCs w:val="16"/>
                     </w:rPr>
-                    <w:t xml:space="preserve">ZEITUNG   </w:t>
+                    <w:t xml:space="preserve">jetzt   </w:t>
                   </w:r>
                   <w:r>
                     <w:rPr>
@@ -2321,7 +2117,7 @@
                       <w:sz w:val="20"/>
                       <w:szCs w:val="20"/>
                     </w:rPr>
-                    <w:t xml:space="preserve">Unsere Handballer </w:t>
+                    <w:t xml:space="preserve">Heute </w:t>
                   </w:r>
                   <w:r>
                     <w:rPr>
@@ -2333,7 +2129,7 @@
                       <w:szCs w:val="20"/>
                       <w:u w:val="single"/>
                     </w:rPr>
-                    <w:t xml:space="preserve">kämpften</w:t>
+                    <w:t xml:space="preserve">analysiere</w:t>
                   </w:r>
                   <w:r>
                     <w:rPr>
@@ -2342,241 +2138,7 @@
                       <w:sz w:val="20"/>
                       <w:szCs w:val="20"/>
                     </w:rPr>
-                    <w:t xml:space="preserve"> bis zur letzten Sekunde.</w:t>
-                  </w:r>
-                </w:p>
-                <w:p>
-                  <w:pPr>
-                    <w:spacing w:after="10" w:before="0"/>
-                  </w:pPr>
-                  <w:r>
-                    <w:rPr>
-                      <w:rFonts w:ascii="Calibri" w:cs="Calibri" w:eastAsia="Calibri" w:hAnsi="Calibri"/>
-                      <w:b/>
-                      <w:bCs/>
-                      <w:color w:val="5B6B8C"/>
-                      <w:sz w:val="16"/>
-                      <w:szCs w:val="16"/>
-                    </w:rPr>
-                    <w:t xml:space="preserve">Vergangenheit   </w:t>
-                  </w:r>
-                  <w:r>
-                    <w:rPr>
-                      <w:rFonts w:ascii="Cambria" w:cs="Cambria" w:eastAsia="Cambria" w:hAnsi="Cambria"/>
-                      <w:b/>
-                      <w:bCs/>
-                      <w:color w:val="1E2761"/>
-                      <w:sz w:val="22"/>
-                      <w:szCs w:val="22"/>
-                    </w:rPr>
-                    <w:t xml:space="preserve">Perfekt</w:t>
-                  </w:r>
-                </w:p>
-                <w:p>
-                  <w:pPr>
-                    <w:spacing w:after="10" w:before="0"/>
-                  </w:pPr>
-                  <w:r>
-                    <w:rPr>
-                      <w:rFonts w:ascii="Calibri" w:cs="Calibri" w:eastAsia="Calibri" w:hAnsi="Calibri"/>
-                      <w:b/>
-                      <w:bCs/>
-                      <w:color w:val="5B6B8C"/>
-                      <w:sz w:val="16"/>
-                      <w:szCs w:val="16"/>
-                    </w:rPr>
-                    <w:t xml:space="preserve">SPRACHNACHRICHT   </w:t>
-                  </w:r>
-                  <w:r>
-                    <w:rPr>
-                      <w:rFonts w:ascii="Cambria" w:cs="Cambria" w:eastAsia="Cambria" w:hAnsi="Cambria"/>
-                      <w:color w:val="000000"/>
-                      <w:sz w:val="20"/>
-                      <w:szCs w:val="20"/>
-                    </w:rPr>
-                    <w:t xml:space="preserve">Ich </w:t>
-                  </w:r>
-                  <w:r>
-                    <w:rPr>
-                      <w:rFonts w:ascii="Cambria" w:cs="Cambria" w:eastAsia="Cambria" w:hAnsi="Cambria"/>
-                      <w:b/>
-                      <w:bCs/>
-                      <w:color w:val="D9534F"/>
-                      <w:sz w:val="20"/>
-                      <w:szCs w:val="20"/>
-                    </w:rPr>
-                    <w:t xml:space="preserve">habe</w:t>
-                  </w:r>
-                  <w:r>
-                    <w:rPr>
-                      <w:rFonts w:ascii="Cambria" w:cs="Cambria" w:eastAsia="Cambria" w:hAnsi="Cambria"/>
-                      <w:color w:val="000000"/>
-                      <w:sz w:val="20"/>
-                      <w:szCs w:val="20"/>
-                    </w:rPr>
-                    <w:t xml:space="preserve"> im Finale Bronze </w:t>
-                  </w:r>
-                  <w:r>
-                    <w:rPr>
-                      <w:rFonts w:ascii="Cambria" w:cs="Cambria" w:eastAsia="Cambria" w:hAnsi="Cambria"/>
-                      <w:b/>
-                      <w:bCs/>
-                      <w:color w:val="C98A1E"/>
-                      <w:sz w:val="20"/>
-                      <w:szCs w:val="20"/>
-                    </w:rPr>
-                    <w:t xml:space="preserve">geholt</w:t>
-                  </w:r>
-                  <w:r>
-                    <w:rPr>
-                      <w:rFonts w:ascii="Cambria" w:cs="Cambria" w:eastAsia="Cambria" w:hAnsi="Cambria"/>
-                      <w:color w:val="000000"/>
-                      <w:sz w:val="20"/>
-                      <w:szCs w:val="20"/>
-                    </w:rPr>
-                    <w:t xml:space="preserve">!</w:t>
-                  </w:r>
-                </w:p>
-                <w:p>
-                  <w:pPr>
-                    <w:spacing w:after="60" w:before="0"/>
-                  </w:pPr>
-                  <w:r>
-                    <w:rPr>
-                      <w:rFonts w:ascii="Calibri" w:cs="Calibri" w:eastAsia="Calibri" w:hAnsi="Calibri"/>
-                      <w:b/>
-                      <w:bCs/>
-                      <w:color w:val="5B6B8C"/>
-                      <w:sz w:val="16"/>
-                      <w:szCs w:val="16"/>
-                    </w:rPr>
-                    <w:t xml:space="preserve">SPRACHNACHRICHT   </w:t>
-                  </w:r>
-                  <w:r>
-                    <w:rPr>
-                      <w:rFonts w:ascii="Cambria" w:cs="Cambria" w:eastAsia="Cambria" w:hAnsi="Cambria"/>
-                      <w:color w:val="000000"/>
-                      <w:sz w:val="20"/>
-                      <w:szCs w:val="20"/>
-                    </w:rPr>
-                    <w:t xml:space="preserve">Wir </w:t>
-                  </w:r>
-                  <w:r>
-                    <w:rPr>
-                      <w:rFonts w:ascii="Cambria" w:cs="Cambria" w:eastAsia="Cambria" w:hAnsi="Cambria"/>
-                      <w:b/>
-                      <w:bCs/>
-                      <w:color w:val="D9534F"/>
-                      <w:sz w:val="20"/>
-                      <w:szCs w:val="20"/>
-                    </w:rPr>
-                    <w:t xml:space="preserve">sind</w:t>
-                  </w:r>
-                  <w:r>
-                    <w:rPr>
-                      <w:rFonts w:ascii="Cambria" w:cs="Cambria" w:eastAsia="Cambria" w:hAnsi="Cambria"/>
-                      <w:color w:val="000000"/>
-                      <w:sz w:val="20"/>
-                      <w:szCs w:val="20"/>
-                    </w:rPr>
-                    <w:t xml:space="preserve"> erst um zehn Uhr nach Hause </w:t>
-                  </w:r>
-                  <w:r>
-                    <w:rPr>
-                      <w:rFonts w:ascii="Cambria" w:cs="Cambria" w:eastAsia="Cambria" w:hAnsi="Cambria"/>
-                      <w:b/>
-                      <w:bCs/>
-                      <w:color w:val="C98A1E"/>
-                      <w:sz w:val="20"/>
-                      <w:szCs w:val="20"/>
-                    </w:rPr>
-                    <w:t xml:space="preserve">gekommen</w:t>
-                  </w:r>
-                  <w:r>
-                    <w:rPr>
-                      <w:rFonts w:ascii="Cambria" w:cs="Cambria" w:eastAsia="Cambria" w:hAnsi="Cambria"/>
-                      <w:color w:val="000000"/>
-                      <w:sz w:val="20"/>
-                      <w:szCs w:val="20"/>
-                    </w:rPr>
-                    <w:t xml:space="preserve">.</w:t>
-                  </w:r>
-                </w:p>
-                <w:p>
-                  <w:pPr>
-                    <w:spacing w:after="60" w:before="0"/>
-                  </w:pPr>
-                  <w:r>
-                    <w:rPr>
-                      <w:rFonts w:ascii="Calibri" w:cs="Calibri" w:eastAsia="Calibri" w:hAnsi="Calibri"/>
-                      <w:b/>
-                      <w:bCs/>
-                      <w:color w:val="5B6B8C"/>
-                      <w:sz w:val="16"/>
-                      <w:szCs w:val="16"/>
-                    </w:rPr>
-                    <w:t xml:space="preserve">jetzt   </w:t>
-                  </w:r>
-                  <w:r>
-                    <w:rPr>
-                      <w:rFonts w:ascii="Cambria" w:cs="Cambria" w:eastAsia="Cambria" w:hAnsi="Cambria"/>
-                      <w:b/>
-                      <w:bCs/>
-                      <w:color w:val="1E2761"/>
-                      <w:sz w:val="22"/>
-                      <w:szCs w:val="22"/>
-                    </w:rPr>
-                    <w:t xml:space="preserve">Präsens</w:t>
-                  </w:r>
-                  <w:r>
-                    <w:rPr>
-                      <w:rFonts w:ascii="Cambria" w:cs="Cambria" w:eastAsia="Cambria" w:hAnsi="Cambria"/>
-                      <w:color w:val="000000"/>
-                      <w:sz w:val="20"/>
-                      <w:szCs w:val="20"/>
-                    </w:rPr>
-                    <w:t xml:space="preserve">   ·   </w:t>
-                  </w:r>
-                  <w:r>
-                    <w:rPr>
-                      <w:rFonts w:ascii="Calibri" w:cs="Calibri" w:eastAsia="Calibri" w:hAnsi="Calibri"/>
-                      <w:b/>
-                      <w:bCs/>
-                      <w:color w:val="5B6B8C"/>
-                      <w:sz w:val="16"/>
-                      <w:szCs w:val="16"/>
-                    </w:rPr>
-                    <w:t xml:space="preserve">POST   </w:t>
-                  </w:r>
-                  <w:r>
-                    <w:rPr>
-                      <w:rFonts w:ascii="Cambria" w:cs="Cambria" w:eastAsia="Cambria" w:hAnsi="Cambria"/>
-                      <w:color w:val="000000"/>
-                      <w:sz w:val="20"/>
-                      <w:szCs w:val="20"/>
-                    </w:rPr>
-                    <w:t xml:space="preserve">Heute </w:t>
-                  </w:r>
-                  <w:r>
-                    <w:rPr>
-                      <w:rFonts w:ascii="Cambria" w:cs="Cambria" w:eastAsia="Cambria" w:hAnsi="Cambria"/>
-                      <w:b/>
-                      <w:bCs/>
-                      <w:color w:val="000000"/>
-                      <w:sz w:val="20"/>
-                      <w:szCs w:val="20"/>
-                      <w:u w:val="single"/>
-                    </w:rPr>
-                    <w:t xml:space="preserve">analysieren</w:t>
-                  </w:r>
-                  <w:r>
-                    <w:rPr>
-                      <w:rFonts w:ascii="Cambria" w:cs="Cambria" w:eastAsia="Cambria" w:hAnsi="Cambria"/>
-                      <w:color w:val="000000"/>
-                      <w:sz w:val="20"/>
-                      <w:szCs w:val="20"/>
-                    </w:rPr>
-                    <w:t xml:space="preserve"> wir mit dem Trainer das Video.</w:t>
+                    <w:t xml:space="preserve"> ich mit ihm das Video.</w:t>
                   </w:r>
                 </w:p>
                 <w:p>
@@ -2597,33 +2159,22 @@
                   <w:r>
                     <w:rPr>
                       <w:rFonts w:ascii="Cambria" w:cs="Cambria" w:eastAsia="Cambria" w:hAnsi="Cambria"/>
-                      <w:b/>
-                      <w:bCs/>
-                      <w:color w:val="1E2761"/>
-                      <w:sz w:val="22"/>
-                      <w:szCs w:val="22"/>
-                    </w:rPr>
-                    <w:t xml:space="preserve">Futur I</w:t>
-                  </w:r>
-                  <w:r>
-                    <w:rPr>
-                      <w:rFonts w:ascii="Cambria" w:cs="Cambria" w:eastAsia="Cambria" w:hAnsi="Cambria"/>
                       <w:color w:val="000000"/>
                       <w:sz w:val="20"/>
                       <w:szCs w:val="20"/>
                     </w:rPr>
-                    <w:t xml:space="preserve">   ·   </w:t>
-                  </w:r>
-                  <w:r>
-                    <w:rPr>
-                      <w:rFonts w:ascii="Calibri" w:cs="Calibri" w:eastAsia="Calibri" w:hAnsi="Calibri"/>
-                      <w:b/>
-                      <w:bCs/>
-                      <w:color w:val="5B6B8C"/>
-                      <w:sz w:val="16"/>
-                      <w:szCs w:val="16"/>
-                    </w:rPr>
-                    <w:t xml:space="preserve">POST   </w:t>
+                    <w:t xml:space="preserve">Beim nächsten Turnier </w:t>
+                  </w:r>
+                  <w:r>
+                    <w:rPr>
+                      <w:rFonts w:ascii="Cambria" w:cs="Cambria" w:eastAsia="Cambria" w:hAnsi="Cambria"/>
+                      <w:b/>
+                      <w:bCs/>
+                      <w:color w:val="D9534F"/>
+                      <w:sz w:val="20"/>
+                      <w:szCs w:val="20"/>
+                    </w:rPr>
+                    <w:t xml:space="preserve">werde</w:t>
                   </w:r>
                   <w:r>
                     <w:rPr>
@@ -2632,27 +2183,7 @@
                       <w:sz w:val="20"/>
                       <w:szCs w:val="20"/>
                     </w:rPr>
-                    <w:t xml:space="preserve">Beim nächsten Turnier </w:t>
-                  </w:r>
-                  <w:r>
-                    <w:rPr>
-                      <w:rFonts w:ascii="Cambria" w:cs="Cambria" w:eastAsia="Cambria" w:hAnsi="Cambria"/>
-                      <w:b/>
-                      <w:bCs/>
-                      <w:color w:val="D9534F"/>
-                      <w:sz w:val="20"/>
-                      <w:szCs w:val="20"/>
-                    </w:rPr>
-                    <w:t xml:space="preserve">werde</w:t>
-                  </w:r>
-                  <w:r>
-                    <w:rPr>
-                      <w:rFonts w:ascii="Cambria" w:cs="Cambria" w:eastAsia="Cambria" w:hAnsi="Cambria"/>
-                      <w:color w:val="000000"/>
-                      <w:sz w:val="20"/>
-                      <w:szCs w:val="20"/>
-                    </w:rPr>
-                    <w:t xml:space="preserve"> ich den Haltegriff besser </w:t>
+                    <w:t xml:space="preserve"> ich früher </w:t>
                   </w:r>
                   <w:r>
                     <w:rPr>
@@ -2663,7 +2194,7 @@
                       <w:sz w:val="20"/>
                       <w:szCs w:val="20"/>
                     </w:rPr>
-                    <w:t xml:space="preserve">verteidigen</w:t>
+                    <w:t xml:space="preserve">angreifen</w:t>
                   </w:r>
                   <w:r>
                     <w:rPr>
@@ -2774,7 +2305,7 @@
                 <w:sz w:val="20"/>
                 <w:szCs w:val="20"/>
               </w:rPr>
-              <w:t xml:space="preserve">macht mündlich mit</w:t>
+              <w:t xml:space="preserve">hört zu</w:t>
             </w:r>
           </w:p>
         </w:tc>
@@ -2819,7 +2350,7 @@
                 <w:sz w:val="21"/>
                 <w:szCs w:val="21"/>
               </w:rPr>
-              <w:t xml:space="preserve">„Stifte liegen. Jetzt der Bauplan: Woraus besteht jede Zeitform? Meldet euch.“</w:t>
+              <w:t xml:space="preserve">„Stifte liegen. Schaut auf den Trainer-Satz: Da stehen zwei Zeitformen in einem Satz. Wer erzählt, schreibt im Präteritum – sagte. Wer spricht, wie der Trainer, nimmt das Perfekt – hast gekämpft.“</w:t>
             </w:r>
           </w:p>
           <w:p>
@@ -2833,32 +2364,7 @@
                 <w:sz w:val="21"/>
                 <w:szCs w:val="21"/>
               </w:rPr>
-              <w:t xml:space="preserve">Bauplan unter den Zeitformnamen an die Tafel schreiben, danach eintragen lassen („Jetzt schreibt ihr ab: die Zeile Bauplan.“).</w:t>
-            </w:r>
-          </w:p>
-          <w:p>
-            <w:pPr>
-              <w:spacing w:after="0" w:before="0"/>
-            </w:pPr>
-            <w:r>
-              <w:rPr>
-                <w:rFonts w:ascii="Calibri" w:cs="Calibri" w:eastAsia="Calibri" w:hAnsi="Calibri"/>
-                <w:b/>
-                <w:bCs/>
-                <w:color w:val="5B6B8C"/>
-                <w:sz w:val="19"/>
-                <w:szCs w:val="19"/>
-              </w:rPr>
-              <w:t xml:space="preserve">Lösung: </w:t>
-            </w:r>
-            <w:r>
-              <w:rPr>
-                <w:rFonts w:ascii="Calibri" w:cs="Calibri" w:eastAsia="Calibri" w:hAnsi="Calibri"/>
-                <w:color w:val="5B6B8C"/>
-                <w:sz w:val="19"/>
-                <w:szCs w:val="19"/>
-              </w:rPr>
-              <w:t xml:space="preserve">Plusquamperfekt: hatte/war + Partizip II · Präteritum: nur finites Verb (Präteritumform) · Perfekt: habe/bin + Partizip II · Präsens: nur finites Verb · Futur I: werde + Infinitiv</w:t>
+              <w:t xml:space="preserve">Der Trainer-Satz hängt im Abschnitt Vergangenheit an der Grenze zwischen Präteritum und Perfekt (die Karten kommen in Phase 2 darüber).</w:t>
             </w:r>
           </w:p>
         </w:tc>
@@ -2903,7 +2409,7 @@
           <w:sz w:val="28"/>
           <w:szCs w:val="28"/>
         </w:rPr>
-        <w:t xml:space="preserve">Welche Zeitform wann? + Merksatz 10</w:t>
+        <w:t xml:space="preserve">Die Übersicht entsteht</w:t>
       </w:r>
       <w:r>
         <w:rPr>
@@ -2914,7 +2420,7 @@
           <w:sz w:val="20"/>
           <w:szCs w:val="20"/>
         </w:rPr>
-        <w:t xml:space="preserve">   7 Min.</w:t>
+        <w:t xml:space="preserve">   13 Min.</w:t>
       </w:r>
     </w:p>
     <w:tbl>
@@ -2982,7 +2488,7 @@
                 <w:sz w:val="20"/>
                 <w:szCs w:val="20"/>
               </w:rPr>
-              <w:t xml:space="preserve">macht mündlich mit</w:t>
+              <w:t xml:space="preserve">kommt an die Tafel</w:t>
             </w:r>
           </w:p>
         </w:tc>
@@ -3027,7 +2533,7 @@
                 <w:sz w:val="21"/>
                 <w:szCs w:val="21"/>
               </w:rPr>
-              <w:t xml:space="preserve">„Stifte liegen. Präteritum und Perfekt hängen am selben Platz – beide erzählen Vergangenes. Schaut auf die Etiketten: Aus welchem Text kommen die Sätze?“</w:t>
+              <w:t xml:space="preserve">„Ihr bekommt einen Schnipsel mit einer Tabelle. Klebt ihn ein. Rechts hängen Karten mit den Zeitformen und den Bauplänen. Kreide-Kette: Wer drankommt, hängt eine Karte über den richtigen Abschnitt und begründet am Satz darunter. Hängt etwas falsch, stellt der Nächste es um. Alle anderen ergänzen die Tabelle: Zeitform, Bauplan und einen Beispielsatz.“</w:t>
             </w:r>
           </w:p>
           <w:p>
@@ -3041,7 +2547,7 @@
                 <w:sz w:val="21"/>
                 <w:szCs w:val="21"/>
               </w:rPr>
-              <w:t xml:space="preserve">Erwartung: Präteritum steht in der Vereinszeitung (geschrieben), Perfekt in der Sprachnachricht (gesprochen). Plusquamperfekt: auch Vereinszeitung – die Vorgeschichte. Präsens und Futur I: Post über heute und morgen.</w:t>
+              <w:t xml:space="preserve">Reihenfolge: erst die fünf Zeitform-Karten, dann die fünf Bauplan-Karten. Jede Karte ein anderer Schüler – zehn Schüler sind an der Tafel.</w:t>
             </w:r>
           </w:p>
           <w:p>
@@ -3055,137 +2561,21 @@
                 <w:sz w:val="21"/>
                 <w:szCs w:val="21"/>
               </w:rPr>
-              <w:t xml:space="preserve">Rückbezug zum Einstieg: „Deshalb habt ihr vorhin im Perfekt erzählt – ihr habt gesprochen.“</w:t>
-            </w:r>
-          </w:p>
-        </w:tc>
-      </w:tr>
-    </w:tbl>
-    <w:p>
-      <w:pPr>
-        <w:spacing w:after="40" w:before="0"/>
-      </w:pPr>
-      <w:r>
-        <w:rPr>
-          <w:rFonts w:ascii="Calibri" w:cs="Calibri" w:eastAsia="Calibri" w:hAnsi="Calibri"/>
-          <w:color w:val="000000"/>
-          <w:sz w:val="22"/>
-          <w:szCs w:val="22"/>
-        </w:rPr>
-        <w:t xml:space="preserve"/>
-      </w:r>
-    </w:p>
-    <w:tbl>
-      <w:tblPr>
-        <w:tblW w:type="dxa" w:w="10206"/>
-        <w:tblBorders>
-          <w:top w:val="single" w:color="auto" w:sz="4"/>
-          <w:left w:val="single" w:color="auto" w:sz="4"/>
-          <w:bottom w:val="single" w:color="auto" w:sz="4"/>
-          <w:right w:val="single" w:color="auto" w:sz="4"/>
-          <w:insideH w:val="single" w:color="auto" w:sz="4"/>
-          <w:insideV w:val="single" w:color="auto" w:sz="4"/>
-        </w:tblBorders>
-      </w:tblPr>
-      <w:tblGrid>
-        <w:gridCol w:w="1700"/>
-        <w:gridCol w:w="8506"/>
-      </w:tblGrid>
-      <w:tr>
-        <w:trPr>
-          <w:cantSplit/>
-        </w:trPr>
-        <w:tc>
-          <w:tcPr>
-            <w:tcW w:type="dxa" w:w="1700"/>
-            <w:tcBorders>
-              <w:top w:val="single" w:color="D5DDEE" w:sz="6"/>
-              <w:left w:val="single" w:color="D5DDEE" w:sz="6"/>
-              <w:bottom w:val="single" w:color="D5DDEE" w:sz="6"/>
-              <w:right w:val="single" w:color="D5DDEE" w:sz="6"/>
-            </w:tcBorders>
-            <w:shd w:fill="F4F7FD" w:color="auto" w:val="clear"/>
-            <w:tcMar>
-              <w:top w:type="dxa" w:w="100"/>
-              <w:left w:type="dxa" w:w="100"/>
-              <w:bottom w:type="dxa" w:w="100"/>
-              <w:right w:type="dxa" w:w="100"/>
-            </w:tcMar>
-            <w:vAlign w:val="top"/>
-          </w:tcPr>
-          <w:p>
-            <w:pPr>
-              <w:spacing w:after="10" w:before="0"/>
-            </w:pPr>
-            <w:r>
-              <w:rPr>
-                <w:rFonts w:ascii="Calibri" w:cs="Calibri" w:eastAsia="Calibri" w:hAnsi="Calibri"/>
-                <w:color w:val="5B6B8C"/>
-                <w:sz w:val="16"/>
-                <w:szCs w:val="16"/>
-              </w:rPr>
-              <w:t xml:space="preserve">Klasse</w:t>
-            </w:r>
-          </w:p>
-          <w:p>
-            <w:pPr>
-              <w:spacing w:after="0" w:before="0"/>
-            </w:pPr>
-            <w:r>
-              <w:rPr>
-                <w:rFonts w:ascii="Calibri" w:cs="Calibri" w:eastAsia="Calibri" w:hAnsi="Calibri"/>
-                <w:b/>
-                <w:bCs/>
-                <w:color w:val="1E2761"/>
-                <w:sz w:val="20"/>
-                <w:szCs w:val="20"/>
-              </w:rPr>
-              <w:t xml:space="preserve">schreibt ab</w:t>
-            </w:r>
-          </w:p>
-        </w:tc>
-        <w:tc>
-          <w:tcPr>
-            <w:tcW w:type="dxa" w:w="8506"/>
-            <w:tcBorders>
-              <w:top w:val="single" w:color="D5DDEE" w:sz="6"/>
-              <w:left w:val="single" w:color="D5DDEE" w:sz="6"/>
-              <w:bottom w:val="single" w:color="D5DDEE" w:sz="6"/>
-              <w:right w:val="single" w:color="D5DDEE" w:sz="6"/>
-            </w:tcBorders>
-            <w:tcMar>
-              <w:top w:type="dxa" w:w="100"/>
-              <w:left w:type="dxa" w:w="160"/>
-              <w:bottom w:type="dxa" w:w="100"/>
-              <w:right w:type="dxa" w:w="100"/>
-            </w:tcMar>
-            <w:vAlign w:val="top"/>
-          </w:tcPr>
-          <w:p>
-            <w:pPr>
-              <w:spacing w:after="60" w:before="0"/>
-            </w:pPr>
-            <w:r>
-              <w:rPr>
-                <w:rFonts w:ascii="Calibri" w:cs="Calibri" w:eastAsia="Calibri" w:hAnsi="Calibri"/>
-                <w:b/>
-                <w:bCs/>
-                <w:color w:val="D9534F"/>
-                <w:sz w:val="20"/>
-                <w:szCs w:val="20"/>
-              </w:rPr>
-              <w:t xml:space="preserve">Ansage: </w:t>
-            </w:r>
-            <w:r>
-              <w:rPr>
-                <w:rFonts w:ascii="Calibri" w:cs="Calibri" w:eastAsia="Calibri" w:hAnsi="Calibri"/>
-                <w:i/>
-                <w:iCs/>
+              <w:t xml:space="preserve">Begründungsmuster: „Präteritum, weil kämpfte nur ein finites Verb ist – ohne Hilfsverb.“ · „hatte/war + Partizip II, weil hatte … trainiert.“</w:t>
+            </w:r>
+          </w:p>
+          <w:p>
+            <w:pPr>
+              <w:spacing w:after="50" w:before="0"/>
+            </w:pPr>
+            <w:r>
+              <w:rPr>
+                <w:rFonts w:ascii="Calibri" w:cs="Calibri" w:eastAsia="Calibri" w:hAnsi="Calibri"/>
                 <w:color w:val="000000"/>
                 <w:sz w:val="21"/>
                 <w:szCs w:val="21"/>
               </w:rPr>
-              <w:t xml:space="preserve">„Jetzt schreibt ihr von der Seitentafel ab: Merksatz 10. Rot umrahmen.“</w:t>
+              <w:t xml:space="preserve">Nach jeder Karte kurz warten, bis alle eingetragen haben. In der Tabelle reicht ein Beispielsatz pro Zeile.</w:t>
             </w:r>
           </w:p>
           <w:tbl>
@@ -3238,7 +2628,7 @@
                       <w:sz w:val="16"/>
                       <w:szCs w:val="16"/>
                     </w:rPr>
-                    <w:t xml:space="preserve">TAFEL · Seitentafel · Merksatz 10 – abschreiben, rot umrahmen</w:t>
+                    <w:t xml:space="preserve">TAFEL · über den Abschnitten · Karten (Lösung)</w:t>
                   </w:r>
                 </w:p>
               </w:tc>
@@ -3267,192 +2657,192 @@
                 </w:tcPr>
                 <w:p>
                   <w:pPr>
-                    <w:spacing w:after="40" w:before="0"/>
+                    <w:spacing w:after="20" w:before="0"/>
                   </w:pPr>
                   <w:r>
                     <w:rPr>
-                      <w:rFonts w:ascii="Cambria" w:cs="Cambria" w:eastAsia="Cambria" w:hAnsi="Cambria"/>
-                      <w:b/>
-                      <w:bCs/>
-                      <w:color w:val="D9534F"/>
+                      <w:rFonts w:ascii="Calibri" w:cs="Calibri" w:eastAsia="Calibri" w:hAnsi="Calibri"/>
+                      <w:b/>
+                      <w:bCs/>
+                      <w:color w:val="5B6B8C"/>
+                      <w:sz w:val="16"/>
+                      <w:szCs w:val="16"/>
+                    </w:rPr>
+                    <w:t xml:space="preserve">vorher   </w:t>
+                  </w:r>
+                  <w:r>
+                    <w:rPr>
+                      <w:rFonts w:ascii="Cambria" w:cs="Cambria" w:eastAsia="Cambria" w:hAnsi="Cambria"/>
+                      <w:b/>
+                      <w:bCs/>
+                      <w:color w:val="1E2761"/>
                       <w:sz w:val="22"/>
                       <w:szCs w:val="22"/>
                     </w:rPr>
-                    <w:t xml:space="preserve">Welche Zeitform wann?</w:t>
+                    <w:t xml:space="preserve">Plusquamperfekt</w:t>
+                  </w:r>
+                  <w:r>
+                    <w:rPr>
+                      <w:rFonts w:ascii="Cambria" w:cs="Cambria" w:eastAsia="Cambria" w:hAnsi="Cambria"/>
+                      <w:color w:val="000000"/>
+                      <w:sz w:val="20"/>
+                      <w:szCs w:val="20"/>
+                    </w:rPr>
+                    <w:t xml:space="preserve">   </w:t>
+                  </w:r>
+                  <w:r>
+                    <w:rPr>
+                      <w:rFonts w:ascii="Cambria" w:cs="Cambria" w:eastAsia="Cambria" w:hAnsi="Cambria"/>
+                      <w:b/>
+                      <w:bCs/>
+                      <w:color w:val="D9534F"/>
+                      <w:sz w:val="20"/>
+                      <w:szCs w:val="20"/>
+                    </w:rPr>
+                    <w:t xml:space="preserve">hatte/war</w:t>
+                  </w:r>
+                  <w:r>
+                    <w:rPr>
+                      <w:rFonts w:ascii="Cambria" w:cs="Cambria" w:eastAsia="Cambria" w:hAnsi="Cambria"/>
+                      <w:color w:val="000000"/>
+                      <w:sz w:val="20"/>
+                      <w:szCs w:val="20"/>
+                    </w:rPr>
+                    <w:t xml:space="preserve"> + </w:t>
+                  </w:r>
+                  <w:r>
+                    <w:rPr>
+                      <w:rFonts w:ascii="Cambria" w:cs="Cambria" w:eastAsia="Cambria" w:hAnsi="Cambria"/>
+                      <w:b/>
+                      <w:bCs/>
+                      <w:color w:val="C98A1E"/>
+                      <w:sz w:val="20"/>
+                      <w:szCs w:val="20"/>
+                    </w:rPr>
+                    <w:t xml:space="preserve">Partizip II</w:t>
                   </w:r>
                 </w:p>
                 <w:p>
                   <w:pPr>
-                    <w:spacing w:after="60" w:before="0"/>
+                    <w:spacing w:after="20" w:before="0"/>
                   </w:pPr>
                   <w:r>
                     <w:rPr>
                       <w:rFonts w:ascii="Calibri" w:cs="Calibri" w:eastAsia="Calibri" w:hAnsi="Calibri"/>
+                      <w:b/>
+                      <w:bCs/>
+                      <w:color w:val="5B6B8C"/>
+                      <w:sz w:val="16"/>
+                      <w:szCs w:val="16"/>
+                    </w:rPr>
+                    <w:t xml:space="preserve">Vergangenheit   </w:t>
+                  </w:r>
+                  <w:r>
+                    <w:rPr>
+                      <w:rFonts w:ascii="Cambria" w:cs="Cambria" w:eastAsia="Cambria" w:hAnsi="Cambria"/>
+                      <w:b/>
+                      <w:bCs/>
+                      <w:color w:val="1E2761"/>
+                      <w:sz w:val="22"/>
+                      <w:szCs w:val="22"/>
+                    </w:rPr>
+                    <w:t xml:space="preserve">Präteritum</w:t>
+                  </w:r>
+                  <w:r>
+                    <w:rPr>
+                      <w:rFonts w:ascii="Cambria" w:cs="Cambria" w:eastAsia="Cambria" w:hAnsi="Cambria"/>
                       <w:color w:val="000000"/>
-                      <w:sz w:val="21"/>
-                      <w:szCs w:val="21"/>
-                    </w:rPr>
-                    <w:t xml:space="preserve">Was </w:t>
-                  </w:r>
+                      <w:sz w:val="20"/>
+                      <w:szCs w:val="20"/>
+                    </w:rPr>
+                    <w:t xml:space="preserve">   finites Verb im Präteritum   ·   </w:t>
+                  </w:r>
+                  <w:r>
+                    <w:rPr>
+                      <w:rFonts w:ascii="Cambria" w:cs="Cambria" w:eastAsia="Cambria" w:hAnsi="Cambria"/>
+                      <w:b/>
+                      <w:bCs/>
+                      <w:color w:val="1E2761"/>
+                      <w:sz w:val="22"/>
+                      <w:szCs w:val="22"/>
+                    </w:rPr>
+                    <w:t xml:space="preserve">Perfekt</w:t>
+                  </w:r>
+                  <w:r>
+                    <w:rPr>
+                      <w:rFonts w:ascii="Cambria" w:cs="Cambria" w:eastAsia="Cambria" w:hAnsi="Cambria"/>
+                      <w:color w:val="000000"/>
+                      <w:sz w:val="20"/>
+                      <w:szCs w:val="20"/>
+                    </w:rPr>
+                    <w:t xml:space="preserve">   </w:t>
+                  </w:r>
+                  <w:r>
+                    <w:rPr>
+                      <w:rFonts w:ascii="Cambria" w:cs="Cambria" w:eastAsia="Cambria" w:hAnsi="Cambria"/>
+                      <w:b/>
+                      <w:bCs/>
+                      <w:color w:val="D9534F"/>
+                      <w:sz w:val="20"/>
+                      <w:szCs w:val="20"/>
+                    </w:rPr>
+                    <w:t xml:space="preserve">habe/bin</w:t>
+                  </w:r>
+                  <w:r>
+                    <w:rPr>
+                      <w:rFonts w:ascii="Cambria" w:cs="Cambria" w:eastAsia="Cambria" w:hAnsi="Cambria"/>
+                      <w:color w:val="000000"/>
+                      <w:sz w:val="20"/>
+                      <w:szCs w:val="20"/>
+                    </w:rPr>
+                    <w:t xml:space="preserve"> + </w:t>
+                  </w:r>
+                  <w:r>
+                    <w:rPr>
+                      <w:rFonts w:ascii="Cambria" w:cs="Cambria" w:eastAsia="Cambria" w:hAnsi="Cambria"/>
+                      <w:b/>
+                      <w:bCs/>
+                      <w:color w:val="C98A1E"/>
+                      <w:sz w:val="20"/>
+                      <w:szCs w:val="20"/>
+                    </w:rPr>
+                    <w:t xml:space="preserve">Partizip II</w:t>
+                  </w:r>
+                </w:p>
+                <w:p>
+                  <w:pPr>
+                    <w:spacing w:after="20" w:before="0"/>
+                  </w:pPr>
                   <w:r>
                     <w:rPr>
                       <w:rFonts w:ascii="Calibri" w:cs="Calibri" w:eastAsia="Calibri" w:hAnsi="Calibri"/>
                       <w:b/>
                       <w:bCs/>
+                      <w:color w:val="5B6B8C"/>
+                      <w:sz w:val="16"/>
+                      <w:szCs w:val="16"/>
+                    </w:rPr>
+                    <w:t xml:space="preserve">jetzt   </w:t>
+                  </w:r>
+                  <w:r>
+                    <w:rPr>
+                      <w:rFonts w:ascii="Cambria" w:cs="Cambria" w:eastAsia="Cambria" w:hAnsi="Cambria"/>
+                      <w:b/>
+                      <w:bCs/>
+                      <w:color w:val="1E2761"/>
+                      <w:sz w:val="22"/>
+                      <w:szCs w:val="22"/>
+                    </w:rPr>
+                    <w:t xml:space="preserve">Präsens</w:t>
+                  </w:r>
+                  <w:r>
+                    <w:rPr>
+                      <w:rFonts w:ascii="Cambria" w:cs="Cambria" w:eastAsia="Cambria" w:hAnsi="Cambria"/>
                       <w:color w:val="000000"/>
-                      <w:sz w:val="21"/>
-                      <w:szCs w:val="21"/>
-                    </w:rPr>
-                    <w:t xml:space="preserve">vorher</w:t>
-                  </w:r>
-                  <w:r>
-                    <w:rPr>
-                      <w:rFonts w:ascii="Calibri" w:cs="Calibri" w:eastAsia="Calibri" w:hAnsi="Calibri"/>
-                      <w:color w:val="000000"/>
-                      <w:sz w:val="21"/>
-                      <w:szCs w:val="21"/>
-                    </w:rPr>
-                    <w:t xml:space="preserve"> war, steht im </w:t>
-                  </w:r>
-                  <w:r>
-                    <w:rPr>
-                      <w:rFonts w:ascii="Calibri" w:cs="Calibri" w:eastAsia="Calibri" w:hAnsi="Calibri"/>
-                      <w:b/>
-                      <w:bCs/>
-                      <w:color w:val="000000"/>
-                      <w:sz w:val="21"/>
-                      <w:szCs w:val="21"/>
-                    </w:rPr>
-                    <w:t xml:space="preserve">Plusquamperfekt</w:t>
-                  </w:r>
-                  <w:r>
-                    <w:rPr>
-                      <w:rFonts w:ascii="Calibri" w:cs="Calibri" w:eastAsia="Calibri" w:hAnsi="Calibri"/>
-                      <w:color w:val="000000"/>
-                      <w:sz w:val="21"/>
-                      <w:szCs w:val="21"/>
-                    </w:rPr>
-                    <w:t xml:space="preserve">. Vergangenes </w:t>
-                  </w:r>
-                  <w:r>
-                    <w:rPr>
-                      <w:rFonts w:ascii="Calibri" w:cs="Calibri" w:eastAsia="Calibri" w:hAnsi="Calibri"/>
-                      <w:b/>
-                      <w:bCs/>
-                      <w:color w:val="000000"/>
-                      <w:sz w:val="21"/>
-                      <w:szCs w:val="21"/>
-                    </w:rPr>
-                    <w:t xml:space="preserve">schreibt</w:t>
-                  </w:r>
-                  <w:r>
-                    <w:rPr>
-                      <w:rFonts w:ascii="Calibri" w:cs="Calibri" w:eastAsia="Calibri" w:hAnsi="Calibri"/>
-                      <w:color w:val="000000"/>
-                      <w:sz w:val="21"/>
-                      <w:szCs w:val="21"/>
-                    </w:rPr>
-                    <w:t xml:space="preserve"> man im </w:t>
-                  </w:r>
-                  <w:r>
-                    <w:rPr>
-                      <w:rFonts w:ascii="Calibri" w:cs="Calibri" w:eastAsia="Calibri" w:hAnsi="Calibri"/>
-                      <w:b/>
-                      <w:bCs/>
-                      <w:color w:val="000000"/>
-                      <w:sz w:val="21"/>
-                      <w:szCs w:val="21"/>
-                    </w:rPr>
-                    <w:t xml:space="preserve">Präteritum</w:t>
-                  </w:r>
-                  <w:r>
-                    <w:rPr>
-                      <w:rFonts w:ascii="Calibri" w:cs="Calibri" w:eastAsia="Calibri" w:hAnsi="Calibri"/>
-                      <w:color w:val="000000"/>
-                      <w:sz w:val="21"/>
-                      <w:szCs w:val="21"/>
-                    </w:rPr>
-                    <w:t xml:space="preserve">, </w:t>
-                  </w:r>
-                  <w:r>
-                    <w:rPr>
-                      <w:rFonts w:ascii="Calibri" w:cs="Calibri" w:eastAsia="Calibri" w:hAnsi="Calibri"/>
-                      <w:b/>
-                      <w:bCs/>
-                      <w:color w:val="000000"/>
-                      <w:sz w:val="21"/>
-                      <w:szCs w:val="21"/>
-                    </w:rPr>
-                    <w:t xml:space="preserve">mündlich</w:t>
-                  </w:r>
-                  <w:r>
-                    <w:rPr>
-                      <w:rFonts w:ascii="Calibri" w:cs="Calibri" w:eastAsia="Calibri" w:hAnsi="Calibri"/>
-                      <w:color w:val="000000"/>
-                      <w:sz w:val="21"/>
-                      <w:szCs w:val="21"/>
-                    </w:rPr>
-                    <w:t xml:space="preserve"> erzählt man meist im </w:t>
-                  </w:r>
-                  <w:r>
-                    <w:rPr>
-                      <w:rFonts w:ascii="Calibri" w:cs="Calibri" w:eastAsia="Calibri" w:hAnsi="Calibri"/>
-                      <w:b/>
-                      <w:bCs/>
-                      <w:color w:val="000000"/>
-                      <w:sz w:val="21"/>
-                      <w:szCs w:val="21"/>
-                    </w:rPr>
-                    <w:t xml:space="preserve">Perfekt</w:t>
-                  </w:r>
-                  <w:r>
-                    <w:rPr>
-                      <w:rFonts w:ascii="Calibri" w:cs="Calibri" w:eastAsia="Calibri" w:hAnsi="Calibri"/>
-                      <w:color w:val="000000"/>
-                      <w:sz w:val="21"/>
-                      <w:szCs w:val="21"/>
-                    </w:rPr>
-                    <w:t xml:space="preserve">. Was jetzt ist: </w:t>
-                  </w:r>
-                  <w:r>
-                    <w:rPr>
-                      <w:rFonts w:ascii="Calibri" w:cs="Calibri" w:eastAsia="Calibri" w:hAnsi="Calibri"/>
-                      <w:b/>
-                      <w:bCs/>
-                      <w:color w:val="000000"/>
-                      <w:sz w:val="21"/>
-                      <w:szCs w:val="21"/>
-                    </w:rPr>
-                    <w:t xml:space="preserve">Präsens</w:t>
-                  </w:r>
-                  <w:r>
-                    <w:rPr>
-                      <w:rFonts w:ascii="Calibri" w:cs="Calibri" w:eastAsia="Calibri" w:hAnsi="Calibri"/>
-                      <w:color w:val="000000"/>
-                      <w:sz w:val="21"/>
-                      <w:szCs w:val="21"/>
-                    </w:rPr>
-                    <w:t xml:space="preserve">. Was kommt: </w:t>
-                  </w:r>
-                  <w:r>
-                    <w:rPr>
-                      <w:rFonts w:ascii="Calibri" w:cs="Calibri" w:eastAsia="Calibri" w:hAnsi="Calibri"/>
-                      <w:b/>
-                      <w:bCs/>
-                      <w:color w:val="000000"/>
-                      <w:sz w:val="21"/>
-                      <w:szCs w:val="21"/>
-                    </w:rPr>
-                    <w:t xml:space="preserve">Futur I</w:t>
-                  </w:r>
-                  <w:r>
-                    <w:rPr>
-                      <w:rFonts w:ascii="Calibri" w:cs="Calibri" w:eastAsia="Calibri" w:hAnsi="Calibri"/>
-                      <w:color w:val="000000"/>
-                      <w:sz w:val="21"/>
-                      <w:szCs w:val="21"/>
-                    </w:rPr>
-                    <w:t xml:space="preserve">.</w:t>
+                      <w:sz w:val="20"/>
+                      <w:szCs w:val="20"/>
+                    </w:rPr>
+                    <w:t xml:space="preserve">   finites Verb im Präsens</w:t>
                   </w:r>
                 </w:p>
                 <w:p>
@@ -3464,40 +2854,62 @@
                       <w:rFonts w:ascii="Calibri" w:cs="Calibri" w:eastAsia="Calibri" w:hAnsi="Calibri"/>
                       <w:b/>
                       <w:bCs/>
+                      <w:color w:val="5B6B8C"/>
+                      <w:sz w:val="16"/>
+                      <w:szCs w:val="16"/>
+                    </w:rPr>
+                    <w:t xml:space="preserve">Zukunft   </w:t>
+                  </w:r>
+                  <w:r>
+                    <w:rPr>
+                      <w:rFonts w:ascii="Cambria" w:cs="Cambria" w:eastAsia="Cambria" w:hAnsi="Cambria"/>
+                      <w:b/>
+                      <w:bCs/>
+                      <w:color w:val="1E2761"/>
+                      <w:sz w:val="22"/>
+                      <w:szCs w:val="22"/>
+                    </w:rPr>
+                    <w:t xml:space="preserve">Futur I</w:t>
+                  </w:r>
+                  <w:r>
+                    <w:rPr>
+                      <w:rFonts w:ascii="Cambria" w:cs="Cambria" w:eastAsia="Cambria" w:hAnsi="Cambria"/>
                       <w:color w:val="000000"/>
-                      <w:sz w:val="21"/>
-                      <w:szCs w:val="21"/>
-                    </w:rPr>
-                    <w:t xml:space="preserve">Wofür? </w:t>
-                  </w:r>
-                  <w:r>
-                    <w:rPr>
-                      <w:rFonts w:ascii="Calibri" w:cs="Calibri" w:eastAsia="Calibri" w:hAnsi="Calibri"/>
+                      <w:sz w:val="20"/>
+                      <w:szCs w:val="20"/>
+                    </w:rPr>
+                    <w:t xml:space="preserve">   </w:t>
+                  </w:r>
+                  <w:r>
+                    <w:rPr>
+                      <w:rFonts w:ascii="Cambria" w:cs="Cambria" w:eastAsia="Cambria" w:hAnsi="Cambria"/>
+                      <w:b/>
+                      <w:bCs/>
+                      <w:color w:val="D9534F"/>
+                      <w:sz w:val="20"/>
+                      <w:szCs w:val="20"/>
+                    </w:rPr>
+                    <w:t xml:space="preserve">werde</w:t>
+                  </w:r>
+                  <w:r>
+                    <w:rPr>
+                      <w:rFonts w:ascii="Cambria" w:cs="Cambria" w:eastAsia="Cambria" w:hAnsi="Cambria"/>
                       <w:color w:val="000000"/>
-                      <w:sz w:val="21"/>
-                      <w:szCs w:val="21"/>
-                    </w:rPr>
-                    <w:t xml:space="preserve">Damit jeder Text die passende Zeitform hat: der Bericht für die Vereinszeitung im Präteritum, die Sprachnachricht im Perfekt. </w:t>
-                  </w:r>
-                  <w:r>
-                    <w:rPr>
-                      <w:rFonts w:ascii="Calibri" w:cs="Calibri" w:eastAsia="Calibri" w:hAnsi="Calibri"/>
-                      <w:b/>
-                      <w:bCs/>
-                      <w:color w:val="000000"/>
-                      <w:sz w:val="21"/>
-                      <w:szCs w:val="21"/>
-                    </w:rPr>
-                    <w:t xml:space="preserve">Test: </w:t>
-                  </w:r>
-                  <w:r>
-                    <w:rPr>
-                      <w:rFonts w:ascii="Calibri" w:cs="Calibri" w:eastAsia="Calibri" w:hAnsi="Calibri"/>
-                      <w:color w:val="000000"/>
-                      <w:sz w:val="21"/>
-                      <w:szCs w:val="21"/>
-                    </w:rPr>
-                    <w:t xml:space="preserve">Wann ist es passiert? Und: Schreibe ich oder spreche ich?</w:t>
+                      <w:sz w:val="20"/>
+                      <w:szCs w:val="20"/>
+                    </w:rPr>
+                    <w:t xml:space="preserve"> + </w:t>
+                  </w:r>
+                  <w:r>
+                    <w:rPr>
+                      <w:rFonts w:ascii="Cambria" w:cs="Cambria" w:eastAsia="Cambria" w:hAnsi="Cambria"/>
+                      <w:b/>
+                      <w:bCs/>
+                      <w:color w:val="3F7CC4"/>
+                      <w:sz w:val="20"/>
+                      <w:szCs w:val="20"/>
+                    </w:rPr>
+                    <w:t xml:space="preserve">Infinitiv</w:t>
                   </w:r>
                 </w:p>
               </w:tc>
@@ -3532,45 +2944,6 @@
           <w:szCs w:val="22"/>
         </w:rPr>
         <w:t xml:space="preserve"/>
-      </w:r>
-    </w:p>
-    <w:p>
-      <w:pPr>
-        <w:keepNext/>
-        <w:spacing w:after="100" w:before="200"/>
-      </w:pPr>
-      <w:r>
-        <w:rPr>
-          <w:rFonts w:ascii="Cambria" w:cs="Cambria" w:eastAsia="Cambria" w:hAnsi="Cambria"/>
-          <w:b/>
-          <w:bCs/>
-          <w:color w:val="D9534F"/>
-          <w:sz w:val="28"/>
-          <w:szCs w:val="28"/>
-        </w:rPr>
-        <w:t xml:space="preserve">3  </w:t>
-      </w:r>
-      <w:r>
-        <w:rPr>
-          <w:rFonts w:ascii="Cambria" w:cs="Cambria" w:eastAsia="Cambria" w:hAnsi="Cambria"/>
-          <w:b/>
-          <w:bCs/>
-          <w:color w:val="1E2761"/>
-          <w:sz w:val="28"/>
-          <w:szCs w:val="28"/>
-        </w:rPr>
-        <w:t xml:space="preserve">Ü12 Der Bericht für die Vereinszeitung</w:t>
-      </w:r>
-      <w:r>
-        <w:rPr>
-          <w:rFonts w:ascii="Calibri" w:cs="Calibri" w:eastAsia="Calibri" w:hAnsi="Calibri"/>
-          <w:b/>
-          <w:bCs/>
-          <w:color w:val="C77C12"/>
-          <w:sz w:val="20"/>
-          <w:szCs w:val="20"/>
-        </w:rPr>
-        <w:t xml:space="preserve">   10 Min.</w:t>
       </w:r>
     </w:p>
     <w:tbl>
@@ -3638,7 +3011,7 @@
                 <w:sz w:val="20"/>
                 <w:szCs w:val="20"/>
               </w:rPr>
-              <w:t xml:space="preserve">arbeitet allein</w:t>
+              <w:t xml:space="preserve">kontrolliert</w:t>
             </w:r>
           </w:p>
         </w:tc>
@@ -3683,7 +3056,7 @@
                 <w:sz w:val="21"/>
                 <w:szCs w:val="21"/>
               </w:rPr>
-              <w:t xml:space="preserve">„Jetzt arbeitet ihr allein. Die Aufgabe steht rechts. Ein Teamkollege hat seinen Bericht so geschrieben, wie er spricht. Vier Verbformen sind falsch. Sieben Minuten.“</w:t>
+              <w:t xml:space="preserve">„Stift hinlegen. Lest unten auf dem Schnipsel „Wofür?“ und „Test“. Wann ist es passiert? Welches Hilfsverb steht da? Damit findet ihr jede Zeitform.“</w:t>
             </w:r>
           </w:p>
           <w:p>
@@ -3697,7 +3070,218 @@
                 <w:sz w:val="21"/>
                 <w:szCs w:val="21"/>
               </w:rPr>
-              <w:t xml:space="preserve">Herumgehen. Wer bei Satz 4 hängt: „Wie heißt es im Perfekt – habe losgefahren oder bin losgefahren?“</w:t>
+              <w:t xml:space="preserve">Ein Schüler liest den Test laut vor und wendet ihn auf einen Satz an der Tafel an.</w:t>
+            </w:r>
+          </w:p>
+        </w:tc>
+      </w:tr>
+    </w:tbl>
+    <w:p>
+      <w:pPr>
+        <w:spacing w:after="40" w:before="0"/>
+      </w:pPr>
+      <w:r>
+        <w:rPr>
+          <w:rFonts w:ascii="Calibri" w:cs="Calibri" w:eastAsia="Calibri" w:hAnsi="Calibri"/>
+          <w:color w:val="000000"/>
+          <w:sz w:val="22"/>
+          <w:szCs w:val="22"/>
+        </w:rPr>
+        <w:t xml:space="preserve"/>
+      </w:r>
+    </w:p>
+    <w:p>
+      <w:pPr>
+        <w:keepNext/>
+        <w:spacing w:after="100" w:before="200"/>
+      </w:pPr>
+      <w:r>
+        <w:rPr>
+          <w:rFonts w:ascii="Cambria" w:cs="Cambria" w:eastAsia="Cambria" w:hAnsi="Cambria"/>
+          <w:b/>
+          <w:bCs/>
+          <w:color w:val="D9534F"/>
+          <w:sz w:val="28"/>
+          <w:szCs w:val="28"/>
+        </w:rPr>
+        <w:t xml:space="preserve">3  </w:t>
+      </w:r>
+      <w:r>
+        <w:rPr>
+          <w:rFonts w:ascii="Cambria" w:cs="Cambria" w:eastAsia="Cambria" w:hAnsi="Cambria"/>
+          <w:b/>
+          <w:bCs/>
+          <w:color w:val="1E2761"/>
+          <w:sz w:val="28"/>
+          <w:szCs w:val="28"/>
+        </w:rPr>
+        <w:t xml:space="preserve">Exit-Ticket: mein Wochenende</w:t>
+      </w:r>
+      <w:r>
+        <w:rPr>
+          <w:rFonts w:ascii="Calibri" w:cs="Calibri" w:eastAsia="Calibri" w:hAnsi="Calibri"/>
+          <w:b/>
+          <w:bCs/>
+          <w:color w:val="C77C12"/>
+          <w:sz w:val="20"/>
+          <w:szCs w:val="20"/>
+        </w:rPr>
+        <w:t xml:space="preserve">   15 Min.</w:t>
+      </w:r>
+    </w:p>
+    <w:tbl>
+      <w:tblPr>
+        <w:tblW w:type="dxa" w:w="10206"/>
+        <w:tblBorders>
+          <w:top w:val="single" w:color="auto" w:sz="4"/>
+          <w:left w:val="single" w:color="auto" w:sz="4"/>
+          <w:bottom w:val="single" w:color="auto" w:sz="4"/>
+          <w:right w:val="single" w:color="auto" w:sz="4"/>
+          <w:insideH w:val="single" w:color="auto" w:sz="4"/>
+          <w:insideV w:val="single" w:color="auto" w:sz="4"/>
+        </w:tblBorders>
+      </w:tblPr>
+      <w:tblGrid>
+        <w:gridCol w:w="1700"/>
+        <w:gridCol w:w="8506"/>
+      </w:tblGrid>
+      <w:tr>
+        <w:trPr>
+          <w:cantSplit/>
+        </w:trPr>
+        <w:tc>
+          <w:tcPr>
+            <w:tcW w:type="dxa" w:w="1700"/>
+            <w:tcBorders>
+              <w:top w:val="single" w:color="D5DDEE" w:sz="6"/>
+              <w:left w:val="single" w:color="D5DDEE" w:sz="6"/>
+              <w:bottom w:val="single" w:color="D5DDEE" w:sz="6"/>
+              <w:right w:val="single" w:color="D5DDEE" w:sz="6"/>
+            </w:tcBorders>
+            <w:shd w:fill="F4F7FD" w:color="auto" w:val="clear"/>
+            <w:tcMar>
+              <w:top w:type="dxa" w:w="100"/>
+              <w:left w:type="dxa" w:w="100"/>
+              <w:bottom w:type="dxa" w:w="100"/>
+              <w:right w:type="dxa" w:w="100"/>
+            </w:tcMar>
+            <w:vAlign w:val="top"/>
+          </w:tcPr>
+          <w:p>
+            <w:pPr>
+              <w:spacing w:after="10" w:before="0"/>
+            </w:pPr>
+            <w:r>
+              <w:rPr>
+                <w:rFonts w:ascii="Calibri" w:cs="Calibri" w:eastAsia="Calibri" w:hAnsi="Calibri"/>
+                <w:color w:val="5B6B8C"/>
+                <w:sz w:val="16"/>
+                <w:szCs w:val="16"/>
+              </w:rPr>
+              <w:t xml:space="preserve">Klasse</w:t>
+            </w:r>
+          </w:p>
+          <w:p>
+            <w:pPr>
+              <w:spacing w:after="0" w:before="0"/>
+            </w:pPr>
+            <w:r>
+              <w:rPr>
+                <w:rFonts w:ascii="Calibri" w:cs="Calibri" w:eastAsia="Calibri" w:hAnsi="Calibri"/>
+                <w:b/>
+                <w:bCs/>
+                <w:color w:val="1E2761"/>
+                <w:sz w:val="20"/>
+                <w:szCs w:val="20"/>
+              </w:rPr>
+              <w:t xml:space="preserve">arbeitet allein</w:t>
+            </w:r>
+          </w:p>
+        </w:tc>
+        <w:tc>
+          <w:tcPr>
+            <w:tcW w:type="dxa" w:w="8506"/>
+            <w:tcBorders>
+              <w:top w:val="single" w:color="D5DDEE" w:sz="6"/>
+              <w:left w:val="single" w:color="D5DDEE" w:sz="6"/>
+              <w:bottom w:val="single" w:color="D5DDEE" w:sz="6"/>
+              <w:right w:val="single" w:color="D5DDEE" w:sz="6"/>
+            </w:tcBorders>
+            <w:tcMar>
+              <w:top w:type="dxa" w:w="100"/>
+              <w:left w:type="dxa" w:w="160"/>
+              <w:bottom w:type="dxa" w:w="100"/>
+              <w:right w:type="dxa" w:w="100"/>
+            </w:tcMar>
+            <w:vAlign w:val="top"/>
+          </w:tcPr>
+          <w:p>
+            <w:pPr>
+              <w:spacing w:after="60" w:before="0"/>
+            </w:pPr>
+            <w:r>
+              <w:rPr>
+                <w:rFonts w:ascii="Calibri" w:cs="Calibri" w:eastAsia="Calibri" w:hAnsi="Calibri"/>
+                <w:b/>
+                <w:bCs/>
+                <w:color w:val="D9534F"/>
+                <w:sz w:val="20"/>
+                <w:szCs w:val="20"/>
+              </w:rPr>
+              <w:t xml:space="preserve">Ansage: </w:t>
+            </w:r>
+            <w:r>
+              <w:rPr>
+                <w:rFonts w:ascii="Calibri" w:cs="Calibri" w:eastAsia="Calibri" w:hAnsi="Calibri"/>
+                <w:i/>
+                <w:iCs/>
+                <w:color w:val="000000"/>
+                <w:sz w:val="21"/>
+                <w:szCs w:val="21"/>
+              </w:rPr>
+              <w:t xml:space="preserve">„Jetzt arbeitet ihr allein. Ihr schreibt über euren Wettkampf am Wochenende – nach dem Muster an der Tafel. Fünf bis sieben Sätze, jede Zeitform mindestens einmal. Die Satzanfänge und Verben auf dem Exit-Ticket helfen euch. Ihr gebt das Ticket am Ende ab.“</w:t>
+            </w:r>
+          </w:p>
+          <w:p>
+            <w:pPr>
+              <w:spacing w:after="50" w:before="0"/>
+            </w:pPr>
+            <w:r>
+              <w:rPr>
+                <w:rFonts w:ascii="Calibri" w:cs="Calibri" w:eastAsia="Calibri" w:hAnsi="Calibri"/>
+                <w:color w:val="000000"/>
+                <w:sz w:val="21"/>
+                <w:szCs w:val="21"/>
+              </w:rPr>
+              <w:t xml:space="preserve">Herumgehen. Typische Stolperstellen: Wechsel ins Perfekt beim Erzählen („Dann habe ich gewonnen“), habe statt hatte in der Vorgeschichte, regelmäßig gebildetes Präteritum („werfte“).</w:t>
+            </w:r>
+          </w:p>
+          <w:p>
+            <w:pPr>
+              <w:spacing w:after="50" w:before="0"/>
+            </w:pPr>
+            <w:r>
+              <w:rPr>
+                <w:rFonts w:ascii="Calibri" w:cs="Calibri" w:eastAsia="Calibri" w:hAnsi="Calibri"/>
+                <w:color w:val="000000"/>
+                <w:sz w:val="21"/>
+                <w:szCs w:val="21"/>
+              </w:rPr>
+              <w:t xml:space="preserve">Wer schnell fertig ist: einen zweiten Satz zur Vorgeschichte schreiben, diesmal mit war.</w:t>
+            </w:r>
+          </w:p>
+          <w:p>
+            <w:pPr>
+              <w:spacing w:after="50" w:before="0"/>
+            </w:pPr>
+            <w:r>
+              <w:rPr>
+                <w:rFonts w:ascii="Calibri" w:cs="Calibri" w:eastAsia="Calibri" w:hAnsi="Calibri"/>
+                <w:color w:val="000000"/>
+                <w:sz w:val="21"/>
+                <w:szCs w:val="21"/>
+              </w:rPr>
+              <w:t xml:space="preserve">Zwei Schüler mit gelungenem Text für das Vorlesen ansprechen.</w:t>
             </w:r>
           </w:p>
           <w:tbl>
@@ -3750,7 +3334,7 @@
                       <w:sz w:val="16"/>
                       <w:szCs w:val="16"/>
                     </w:rPr>
-                    <w:t xml:space="preserve">TAFEL · rechts · Ü12 Der Bericht für die Vereinszeitung</w:t>
+                    <w:t xml:space="preserve">TAFEL · rechts · Exit-Ticket: Mein Wochenende in fünf Zeitformen</w:t>
                   </w:r>
                 </w:p>
               </w:tc>
@@ -3801,7 +3385,7 @@
                       <w:sz w:val="21"/>
                       <w:szCs w:val="21"/>
                     </w:rPr>
-                    <w:t xml:space="preserve">Klebe den Schnipsel Ü12 ins Heft.</w:t>
+                    <w:t xml:space="preserve">Schreibe 5–7 Sätze über deinen Wettkampf am Wochenende.</w:t>
                   </w:r>
                 </w:p>
                 <w:p>
@@ -3828,7 +3412,7 @@
                       <w:sz w:val="21"/>
                       <w:szCs w:val="21"/>
                     </w:rPr>
-                    <w:t xml:space="preserve">Unterstreiche die vier Verbformen, die falsch sind.</w:t>
+                    <w:t xml:space="preserve">Benutze jede Zeitform mindestens einmal.</w:t>
                   </w:r>
                 </w:p>
                 <w:p>
@@ -3855,7 +3439,7 @@
                       <w:sz w:val="21"/>
                       <w:szCs w:val="21"/>
                     </w:rPr>
-                    <w:t xml:space="preserve">Schreibe die richtige Form darüber.</w:t>
+                    <w:t xml:space="preserve">Markiere Hilfsverb rot, Partizip II gelb, Infinitiv blau.</w:t>
                   </w:r>
                 </w:p>
                 <w:p>
@@ -3882,7 +3466,7 @@
                       <w:sz w:val="21"/>
                       <w:szCs w:val="21"/>
                     </w:rPr>
-                    <w:t xml:space="preserve">Begründe einen Fehler im Heft: „… ist falsch, weil …“</w:t>
+                    <w:t xml:space="preserve">Hake die Checkliste ab.</w:t>
                   </w:r>
                 </w:p>
                 <w:p>
@@ -3912,7 +3496,7 @@
                       <w:sz w:val="20"/>
                       <w:szCs w:val="20"/>
                     </w:rPr>
-                    <w:t xml:space="preserve">Zusatz: Was hattest du vor deinem Wettkampf gemacht? Ein Satz im Plusquamperfekt.</w:t>
+                    <w:t xml:space="preserve">Hilfe: Mustertext an der Tafel, Satzanfänge und Verben auf dem Ticket.</w:t>
                   </w:r>
                 </w:p>
                 <w:p>
@@ -3951,7 +3535,7 @@
                       <w:sz w:val="19"/>
                       <w:szCs w:val="19"/>
                     </w:rPr>
-                    <w:t xml:space="preserve">7 Minuten · allein · leise</w:t>
+                    <w:t xml:space="preserve">12 Minuten · allein · leise</w:t>
                   </w:r>
                   <w:r>
                     <w:rPr>
@@ -3980,31 +3564,6 @@
                 <w:szCs w:val="22"/>
               </w:rPr>
               <w:t xml:space="preserve"/>
-            </w:r>
-          </w:p>
-          <w:p>
-            <w:pPr>
-              <w:spacing w:after="0" w:before="0"/>
-            </w:pPr>
-            <w:r>
-              <w:rPr>
-                <w:rFonts w:ascii="Calibri" w:cs="Calibri" w:eastAsia="Calibri" w:hAnsi="Calibri"/>
-                <w:b/>
-                <w:bCs/>
-                <w:color w:val="5B6B8C"/>
-                <w:sz w:val="19"/>
-                <w:szCs w:val="19"/>
-              </w:rPr>
-              <w:t xml:space="preserve">Lösung: </w:t>
-            </w:r>
-            <w:r>
-              <w:rPr>
-                <w:rFonts w:ascii="Calibri" w:cs="Calibri" w:eastAsia="Calibri" w:hAnsi="Calibri"/>
-                <w:color w:val="5B6B8C"/>
-                <w:sz w:val="19"/>
-                <w:szCs w:val="19"/>
-              </w:rPr>
-              <w:t xml:space="preserve">Satz 1 sind … gefahren → fuhren (Bericht = Präteritum) · Satz 3 hat … gewonnen → gewann · Satz 4 hatten … losgefahren → waren … losgefahren (losfahren bildet mit sein) · Satz 6 werften → warfen (werfen ist unregelmäßig). Sätze 2, 5, 7 sind richtig.</w:t>
             </w:r>
           </w:p>
         </w:tc>
@@ -4049,7 +3608,7 @@
           <w:sz w:val="28"/>
           <w:szCs w:val="28"/>
         </w:rPr>
-        <w:t xml:space="preserve">Kreide-Kette: Fehlerstreifen</w:t>
+        <w:t xml:space="preserve">Vorlesen und einsammeln</w:t>
       </w:r>
       <w:r>
         <w:rPr>
@@ -4060,7 +3619,7 @@
           <w:sz w:val="20"/>
           <w:szCs w:val="20"/>
         </w:rPr>
-        <w:t xml:space="preserve">   8 Min.</w:t>
+        <w:t xml:space="preserve">   5 Min.</w:t>
       </w:r>
     </w:p>
     <w:tbl>
@@ -4128,7 +3687,7 @@
                 <w:sz w:val="20"/>
                 <w:szCs w:val="20"/>
               </w:rPr>
-              <w:t xml:space="preserve">kommt an die Tafel</w:t>
+              <w:t xml:space="preserve">macht mündlich mit</w:t>
             </w:r>
           </w:p>
         </w:tc>
@@ -4173,7 +3732,7 @@
                 <w:sz w:val="21"/>
                 <w:szCs w:val="21"/>
               </w:rPr>
-              <w:t xml:space="preserve">„Wer drankommt, schreibt die richtige Verbform unter den Streifen und begründet. Alle prüfen mit. Vergleicht und verbessert mit Grün.“</w:t>
+              <w:t xml:space="preserve">„Stifte liegen. Zwei lesen ihren Text vor. Alle anderen zeigen am Zeitstrahl mit: Wo sind wir gerade – vorher, Vergangenheit, jetzt oder Zukunft?“</w:t>
             </w:r>
           </w:p>
           <w:p>
@@ -4187,259 +3746,7 @@
                 <w:sz w:val="21"/>
                 <w:szCs w:val="21"/>
               </w:rPr>
-              <w:t xml:space="preserve">Begründungen mit Fachbegriffen und Bezug auf Merksatz 10: „Im Bericht steht das Präteritum – sind gefahren ist Perfekt, das sagt man mündlich.“</w:t>
-            </w:r>
-          </w:p>
-          <w:p>
-            <w:pPr>
-              <w:spacing w:after="50" w:before="0"/>
-            </w:pPr>
-            <w:r>
-              <w:rPr>
-                <w:rFonts w:ascii="Calibri" w:cs="Calibri" w:eastAsia="Calibri" w:hAnsi="Calibri"/>
-                <w:color w:val="000000"/>
-                <w:sz w:val="21"/>
-                <w:szCs w:val="21"/>
-              </w:rPr>
-              <w:t xml:space="preserve">Wird die Zeit knapp: nur Satz 1 und Satz 4 besprechen (je ein Fehlertyp: Zeitform gewählt / Hilfsverb), den Rest nächste Stunde.</w:t>
-            </w:r>
-          </w:p>
-          <w:tbl>
-            <w:tblPr>
-              <w:tblW w:type="dxa" w:w="8166"/>
-              <w:tblBorders>
-                <w:top w:val="single" w:color="auto" w:sz="4"/>
-                <w:left w:val="single" w:color="auto" w:sz="4"/>
-                <w:bottom w:val="single" w:color="auto" w:sz="4"/>
-                <w:right w:val="single" w:color="auto" w:sz="4"/>
-                <w:insideH w:val="single" w:color="auto" w:sz="4"/>
-                <w:insideV w:val="single" w:color="auto" w:sz="4"/>
-              </w:tblBorders>
-            </w:tblPr>
-            <w:tblGrid>
-              <w:gridCol w:w="8166"/>
-            </w:tblGrid>
-            <w:tr>
-              <w:trPr>
-                <w:cantSplit/>
-              </w:trPr>
-              <w:tc>
-                <w:tcPr>
-                  <w:tcW w:type="dxa" w:w="8166"/>
-                  <w:tcBorders>
-                    <w:top w:val="single" w:color="3D4A3F" w:sz="12"/>
-                    <w:left w:val="single" w:color="3D4A3F" w:sz="12"/>
-                    <w:bottom w:val="single" w:color="3D4A3F" w:sz="12"/>
-                    <w:right w:val="single" w:color="3D4A3F" w:sz="12"/>
-                  </w:tcBorders>
-                  <w:shd w:fill="3D4A3F" w:color="auto" w:val="clear"/>
-                  <w:tcMar>
-                    <w:top w:type="dxa" w:w="30"/>
-                    <w:left w:type="dxa" w:w="100"/>
-                    <w:bottom w:type="dxa" w:w="30"/>
-                    <w:right w:type="dxa" w:w="100"/>
-                  </w:tcMar>
-                  <w:vAlign w:val="center"/>
-                </w:tcPr>
-                <w:p>
-                  <w:pPr>
-                    <w:spacing w:after="0" w:before="0"/>
-                  </w:pPr>
-                  <w:r>
-                    <w:rPr>
-                      <w:rFonts w:ascii="Calibri" w:cs="Calibri" w:eastAsia="Calibri" w:hAnsi="Calibri"/>
-                      <w:b/>
-                      <w:bCs/>
-                      <w:color w:val="FFFFFF"/>
-                      <w:sz w:val="16"/>
-                      <w:szCs w:val="16"/>
-                    </w:rPr>
-                    <w:t xml:space="preserve">TAFEL · unter dem Zeitstrahl · vier Fehlerstreifen</w:t>
-                  </w:r>
-                </w:p>
-              </w:tc>
-            </w:tr>
-            <w:tr>
-              <w:trPr>
-                <w:cantSplit/>
-              </w:trPr>
-              <w:tc>
-                <w:tcPr>
-                  <w:tcW w:type="dxa" w:w="8166"/>
-                  <w:tcBorders>
-                    <w:top w:val="single" w:color="3D4A3F" w:sz="12"/>
-                    <w:left w:val="single" w:color="3D4A3F" w:sz="12"/>
-                    <w:bottom w:val="single" w:color="3D4A3F" w:sz="12"/>
-                    <w:right w:val="single" w:color="3D4A3F" w:sz="12"/>
-                  </w:tcBorders>
-                  <w:shd w:fill="F3F6F1" w:color="auto" w:val="clear"/>
-                  <w:tcMar>
-                    <w:top w:type="dxa" w:w="100"/>
-                    <w:left w:type="dxa" w:w="160"/>
-                    <w:bottom w:type="dxa" w:w="100"/>
-                    <w:right w:type="dxa" w:w="100"/>
-                  </w:tcMar>
-                  <w:vAlign w:val="center"/>
-                </w:tcPr>
-                <w:p>
-                  <w:pPr>
-                    <w:spacing w:after="30" w:before="0"/>
-                  </w:pPr>
-                  <w:r>
-                    <w:rPr>
-                      <w:rFonts w:ascii="Calibri" w:cs="Calibri" w:eastAsia="Calibri" w:hAnsi="Calibri"/>
-                      <w:b/>
-                      <w:bCs/>
-                      <w:color w:val="5B6B8C"/>
-                      <w:sz w:val="16"/>
-                      <w:szCs w:val="16"/>
-                    </w:rPr>
-                    <w:t xml:space="preserve">SATZ 1   </w:t>
-                  </w:r>
-                  <w:r>
-                    <w:rPr>
-                      <w:rFonts w:ascii="Cambria" w:cs="Cambria" w:eastAsia="Cambria" w:hAnsi="Cambria"/>
-                      <w:color w:val="000000"/>
-                      <w:sz w:val="20"/>
-                      <w:szCs w:val="20"/>
-                    </w:rPr>
-                    <w:t xml:space="preserve">Am Samstag sind unsere Judoka nach Leipzig gefahren.</w:t>
-                  </w:r>
-                  <w:r>
-                    <w:rPr>
-                      <w:rFonts w:ascii="Cambria" w:cs="Cambria" w:eastAsia="Cambria" w:hAnsi="Cambria"/>
-                      <w:b/>
-                      <w:bCs/>
-                      <w:color w:val="2E9E6B"/>
-                      <w:sz w:val="20"/>
-                      <w:szCs w:val="20"/>
-                    </w:rPr>
-                    <w:t xml:space="preserve">   →  fuhren</w:t>
-                  </w:r>
-                </w:p>
-                <w:p>
-                  <w:pPr>
-                    <w:spacing w:after="30" w:before="0"/>
-                  </w:pPr>
-                  <w:r>
-                    <w:rPr>
-                      <w:rFonts w:ascii="Calibri" w:cs="Calibri" w:eastAsia="Calibri" w:hAnsi="Calibri"/>
-                      <w:b/>
-                      <w:bCs/>
-                      <w:color w:val="5B6B8C"/>
-                      <w:sz w:val="16"/>
-                      <w:szCs w:val="16"/>
-                    </w:rPr>
-                    <w:t xml:space="preserve">SATZ 3   </w:t>
-                  </w:r>
-                  <w:r>
-                    <w:rPr>
-                      <w:rFonts w:ascii="Cambria" w:cs="Cambria" w:eastAsia="Cambria" w:hAnsi="Cambria"/>
-                      <w:color w:val="000000"/>
-                      <w:sz w:val="20"/>
-                      <w:szCs w:val="20"/>
-                    </w:rPr>
-                    <w:t xml:space="preserve">Im Halbfinale hat eine Judoka mit einem Haltegriff gewonnen.</w:t>
-                  </w:r>
-                  <w:r>
-                    <w:rPr>
-                      <w:rFonts w:ascii="Cambria" w:cs="Cambria" w:eastAsia="Cambria" w:hAnsi="Cambria"/>
-                      <w:b/>
-                      <w:bCs/>
-                      <w:color w:val="2E9E6B"/>
-                      <w:sz w:val="20"/>
-                      <w:szCs w:val="20"/>
-                    </w:rPr>
-                    <w:t xml:space="preserve">   →  gewann</w:t>
-                  </w:r>
-                </w:p>
-                <w:p>
-                  <w:pPr>
-                    <w:spacing w:after="30" w:before="0"/>
-                  </w:pPr>
-                  <w:r>
-                    <w:rPr>
-                      <w:rFonts w:ascii="Calibri" w:cs="Calibri" w:eastAsia="Calibri" w:hAnsi="Calibri"/>
-                      <w:b/>
-                      <w:bCs/>
-                      <w:color w:val="5B6B8C"/>
-                      <w:sz w:val="16"/>
-                      <w:szCs w:val="16"/>
-                    </w:rPr>
-                    <w:t xml:space="preserve">SATZ 4   </w:t>
-                  </w:r>
-                  <w:r>
-                    <w:rPr>
-                      <w:rFonts w:ascii="Cambria" w:cs="Cambria" w:eastAsia="Cambria" w:hAnsi="Cambria"/>
-                      <w:color w:val="000000"/>
-                      <w:sz w:val="20"/>
-                      <w:szCs w:val="20"/>
-                    </w:rPr>
-                    <w:t xml:space="preserve">Unsere Gewichtheber hatten schon um sechs Uhr losgefahren.</w:t>
-                  </w:r>
-                  <w:r>
-                    <w:rPr>
-                      <w:rFonts w:ascii="Cambria" w:cs="Cambria" w:eastAsia="Cambria" w:hAnsi="Cambria"/>
-                      <w:b/>
-                      <w:bCs/>
-                      <w:color w:val="2E9E6B"/>
-                      <w:sz w:val="20"/>
-                      <w:szCs w:val="20"/>
-                    </w:rPr>
-                    <w:t xml:space="preserve">   →  waren … losgefahren</w:t>
-                  </w:r>
-                </w:p>
-                <w:p>
-                  <w:pPr>
-                    <w:spacing w:after="0" w:before="0"/>
-                  </w:pPr>
-                  <w:r>
-                    <w:rPr>
-                      <w:rFonts w:ascii="Calibri" w:cs="Calibri" w:eastAsia="Calibri" w:hAnsi="Calibri"/>
-                      <w:b/>
-                      <w:bCs/>
-                      <w:color w:val="5B6B8C"/>
-                      <w:sz w:val="16"/>
-                      <w:szCs w:val="16"/>
-                    </w:rPr>
-                    <w:t xml:space="preserve">SATZ 6   </w:t>
-                  </w:r>
-                  <w:r>
-                    <w:rPr>
-                      <w:rFonts w:ascii="Cambria" w:cs="Cambria" w:eastAsia="Cambria" w:hAnsi="Cambria"/>
-                      <w:color w:val="000000"/>
-                      <w:sz w:val="20"/>
-                      <w:szCs w:val="20"/>
-                    </w:rPr>
-                    <w:t xml:space="preserve">Die Handballer werften am Sonntag 28 Tore.</w:t>
-                  </w:r>
-                  <w:r>
-                    <w:rPr>
-                      <w:rFonts w:ascii="Cambria" w:cs="Cambria" w:eastAsia="Cambria" w:hAnsi="Cambria"/>
-                      <w:b/>
-                      <w:bCs/>
-                      <w:color w:val="2E9E6B"/>
-                      <w:sz w:val="20"/>
-                      <w:szCs w:val="20"/>
-                    </w:rPr>
-                    <w:t xml:space="preserve">   →  warfen</w:t>
-                  </w:r>
-                </w:p>
-              </w:tc>
-            </w:tr>
-          </w:tbl>
-          <w:p>
-            <w:pPr>
-              <w:spacing w:after="20" w:before="0"/>
-            </w:pPr>
-            <w:r>
-              <w:rPr>
-                <w:rFonts w:ascii="Calibri" w:cs="Calibri" w:eastAsia="Calibri" w:hAnsi="Calibri"/>
-                <w:color w:val="000000"/>
-                <w:sz w:val="22"/>
-                <w:szCs w:val="22"/>
-              </w:rPr>
-              <w:t xml:space="preserve"/>
+              <w:t xml:space="preserve">Die Lehrkraft zeigt beim Vorlesen am Zeitstrahl mit, die Klasse nennt die Zeitform.</w:t>
             </w:r>
           </w:p>
         </w:tc>
@@ -4457,45 +3764,6 @@
           <w:szCs w:val="22"/>
         </w:rPr>
         <w:t xml:space="preserve"/>
-      </w:r>
-    </w:p>
-    <w:p>
-      <w:pPr>
-        <w:keepNext/>
-        <w:spacing w:after="100" w:before="200"/>
-      </w:pPr>
-      <w:r>
-        <w:rPr>
-          <w:rFonts w:ascii="Cambria" w:cs="Cambria" w:eastAsia="Cambria" w:hAnsi="Cambria"/>
-          <w:b/>
-          <w:bCs/>
-          <w:color w:val="D9534F"/>
-          <w:sz w:val="28"/>
-          <w:szCs w:val="28"/>
-        </w:rPr>
-        <w:t xml:space="preserve">5  </w:t>
-      </w:r>
-      <w:r>
-        <w:rPr>
-          <w:rFonts w:ascii="Cambria" w:cs="Cambria" w:eastAsia="Cambria" w:hAnsi="Cambria"/>
-          <w:b/>
-          <w:bCs/>
-          <w:color w:val="1E2761"/>
-          <w:sz w:val="28"/>
-          <w:szCs w:val="28"/>
-        </w:rPr>
-        <w:t xml:space="preserve">Ausblick und Hausaufgabe</w:t>
-      </w:r>
-      <w:r>
-        <w:rPr>
-          <w:rFonts w:ascii="Calibri" w:cs="Calibri" w:eastAsia="Calibri" w:hAnsi="Calibri"/>
-          <w:b/>
-          <w:bCs/>
-          <w:color w:val="C77C12"/>
-          <w:sz w:val="20"/>
-          <w:szCs w:val="20"/>
-        </w:rPr>
-        <w:t xml:space="preserve">   3 Min.</w:t>
       </w:r>
     </w:p>
     <w:tbl>
@@ -4563,7 +3831,7 @@
                 <w:sz w:val="20"/>
                 <w:szCs w:val="20"/>
               </w:rPr>
-              <w:t xml:space="preserve">hört zu</w:t>
+              <w:t xml:space="preserve">gibt ab</w:t>
             </w:r>
           </w:p>
         </w:tc>
@@ -4608,7 +3876,7 @@
                 <w:sz w:val="21"/>
                 <w:szCs w:val="21"/>
               </w:rPr>
-              <w:t xml:space="preserve">„Stifte liegen. Beantwortet die Stundenfrage in einem Satz: Welche Zeitform wann?“</w:t>
+              <w:t xml:space="preserve">„Beantwortet die Stundenfrage in einem Satz: Welche Zeitform wann? … Gebt jetzt eure Exit-Tickets ab.“</w:t>
             </w:r>
           </w:p>
           <w:p>
@@ -4622,7 +3890,7 @@
                 <w:sz w:val="21"/>
                 <w:szCs w:val="21"/>
               </w:rPr>
-              <w:t xml:space="preserve">Ein Schüler antwortet. Danach Hausaufgabe nennen: „Schreibt euren Bericht über dieses Wochenende für die Vereinszeitung – im Präteritum, die Vorgeschichte im Plusquamperfekt. Nehmt den Schreibrahmen Ü11.“</w:t>
+              <w:t xml:space="preserve">Erwartete Antwort: Was vorher war: Plusquamperfekt; erzählte Vergangenheit: Präteritum, gesprochen: Perfekt; jetzt: Präsens; Zukunft: Futur I.</w:t>
             </w:r>
           </w:p>
         </w:tc>
@@ -4664,7 +3932,7 @@
           <w:sz w:val="21"/>
           <w:szCs w:val="21"/>
         </w:rPr>
-        <w:t xml:space="preserve">Nächste Stunde: Partner-Check der Berichte. Danach: Futur II, Hilfsverb oder Vollverb, Modalverben – und zum Schluss die Satzklammer.</w:t>
+        <w:t xml:space="preserve">Die Exit-Tickets zeigen, wer die Zeitformen schon sicher im Text einsetzt. Nächste Stunde: Rückgabe mit kurzem Feedback, Überarbeitung, danach Futur II, Hilfsverb oder Vollverb, Modalverben – und zum Schluss die Satzklammer.</w:t>
       </w:r>
     </w:p>
     <w:sectPr>

</xml_diff>

<commit_message>
Mustertext: Heimwettkampf in Frankfurt (Oder) statt Leipzig
Co-Authored-By: Claude Opus 5.5 <noreply@anthropic.com>
Claude-Session: https://claude.ai/code/session_01KXvLXHMYPnCyEbMRgNaaYs
</commit_message>
<xml_diff>
--- a/Deutsch_7A/Zeitformen_Zeitstrahl/Tafelskript_Zeitformen_Zeitstrahl.docx
+++ b/Deutsch_7A/Zeitformen_Zeitstrahl/Tafelskript_Zeitformen_Zeitstrahl.docx
@@ -1874,7 +1874,7 @@
                       <w:sz w:val="20"/>
                       <w:szCs w:val="20"/>
                     </w:rPr>
-                    <w:t xml:space="preserve">Am Freitag </w:t>
+                    <w:t xml:space="preserve">Am Morgen </w:t>
                   </w:r>
                   <w:r>
                     <w:rPr>
@@ -1894,7 +1894,7 @@
                       <w:sz w:val="20"/>
                       <w:szCs w:val="20"/>
                     </w:rPr>
-                    <w:t xml:space="preserve"> wir mit dem Team nach Leipzig </w:t>
+                    <w:t xml:space="preserve"> wir früh zur Halle in Frankfurt (Oder) </w:t>
                   </w:r>
                   <w:r>
                     <w:rPr>

</xml_diff>